<commit_message>
fix: fixed some issues
</commit_message>
<xml_diff>
--- a/system-development/guides/development-guide-ar.docx
+++ b/system-development/guides/development-guide-ar.docx
@@ -44,35 +44,7 @@
         <w:jc w:val="start"/>
       </w:pPr>
       <w:r>
-        <w:rPr>
-          <w:rFonts w:ascii="Tahoma" w:hAnsi="Tahoma" w:eastAsia="Tahoma" w:cs="Tahoma"/>
-          <w:color w:val="000000"/>
-          <w:rtl w:val="1"/>
-          <w:lang w:val="ar-SA" w:eastAsia="ar-SA" w:bidi="ar-SA"/>
-          <w:cs w:val="1"/>
-          <w:szCs w:val="22"/>
-        </w:rPr>
-        <w:t xml:space="preserve">الإصدار </w:t>
-      </w:r>
-      <w:r>
-        <w:rPr>
-          <w:rFonts w:ascii="Tahoma" w:hAnsi="Tahoma" w:eastAsia="Tahoma" w:cs="Tahoma"/>
-          <w:color w:val="000000"/>
-          <w:rtl w:val="0"/>
-          <w:lang w:val="en-US" w:eastAsia="ar-SA" w:bidi="ar-SA"/>
-        </w:rPr>
-        <w:t>‎1.1.2‎</w:t>
-      </w:r>
-      <w:r>
-        <w:rPr>
-          <w:rFonts w:ascii="Tahoma" w:hAnsi="Tahoma" w:eastAsia="Tahoma" w:cs="Tahoma"/>
-          <w:color w:val="000000"/>
-          <w:rtl w:val="1"/>
-          <w:lang w:val="ar-SA" w:eastAsia="ar-SA" w:bidi="ar-SA"/>
-          <w:cs w:val="1"/>
-          <w:szCs w:val="22"/>
-        </w:rPr>
-        <w:t xml:space="preserve"> · مراجعة ٨ أكتوبر ٢٠٢٦</w:t>
+        <w:t>1.4.0 · 2026-10-10</w:t>
       </w:r>
     </w:p>
     <w:p>
@@ -274,7 +246,7 @@
           <w:rtl w:val="0"/>
           <w:lang w:val="en-US" w:eastAsia="ar-SA" w:bidi="ar-SA"/>
         </w:rPr>
-        <w:t>‎PrintNode‎</w:t>
+        <w:t>‎CUPS‎</w:t>
       </w:r>
       <w:r>
         <w:rPr>
@@ -947,7 +919,7 @@
               <w:left w:w="100" w:type="dxa"/>
               <w:right w:w="100" w:type="dxa"/>
             </w:tcMar>
-            <w:shd w:fill="E7EDF2"/>
+            <w:shd w:fill="D9D9D9" w:val="clear"/>
           </w:tcPr>
           <w:p>
             <w:pPr>
@@ -981,7 +953,7 @@
               <w:left w:w="100" w:type="dxa"/>
               <w:right w:w="100" w:type="dxa"/>
             </w:tcMar>
-            <w:shd w:fill="E7EDF2"/>
+            <w:shd w:fill="D9D9D9" w:val="clear"/>
           </w:tcPr>
           <w:p>
             <w:pPr>
@@ -1517,103 +1489,10 @@
       </w:pPr>
       <w:r>
         <w:rPr>
-          <w:rFonts w:ascii="Tahoma" w:hAnsi="Tahoma" w:eastAsia="Tahoma" w:cs="Tahoma"/>
-          <w:color w:val="000000"/>
-          <w:rtl w:val="0"/>
-          <w:lang w:val="en-US" w:eastAsia="ar-SA" w:bidi="ar-SA"/>
-        </w:rPr>
-        <w:t>‎classic‎</w:t>
-      </w:r>
-      <w:r>
-        <w:rPr>
-          <w:rFonts w:ascii="Tahoma" w:hAnsi="Tahoma" w:eastAsia="Tahoma" w:cs="Tahoma"/>
-          <w:color w:val="000000"/>
+          <w:lang w:val="ar-SA" w:bidi="ar-SA"/>
           <w:rtl w:val="1"/>
-          <w:lang w:val="ar-SA" w:eastAsia="ar-SA" w:bidi="ar-SA"/>
-          <w:cs w:val="1"/>
-          <w:szCs w:val="22"/>
-        </w:rPr>
-        <w:t xml:space="preserve"> و</w:t>
-      </w:r>
-      <w:r>
-        <w:rPr>
-          <w:rFonts w:ascii="Tahoma" w:hAnsi="Tahoma" w:eastAsia="Tahoma" w:cs="Tahoma"/>
-          <w:color w:val="000000"/>
-          <w:rtl w:val="0"/>
-          <w:lang w:val="en-US" w:eastAsia="ar-SA" w:bidi="ar-SA"/>
-        </w:rPr>
-        <w:t>‎compact‎</w:t>
-      </w:r>
-      <w:r>
-        <w:rPr>
-          <w:rFonts w:ascii="Tahoma" w:hAnsi="Tahoma" w:eastAsia="Tahoma" w:cs="Tahoma"/>
-          <w:color w:val="000000"/>
-          <w:rtl w:val="1"/>
-          <w:lang w:val="ar-SA" w:eastAsia="ar-SA" w:bidi="ar-SA"/>
-          <w:cs w:val="1"/>
-          <w:szCs w:val="22"/>
-        </w:rPr>
-        <w:t xml:space="preserve"> بحجم </w:t>
-      </w:r>
-      <w:r>
-        <w:rPr>
-          <w:rFonts w:ascii="Tahoma" w:hAnsi="Tahoma" w:eastAsia="Tahoma" w:cs="Tahoma"/>
-          <w:color w:val="000000"/>
-          <w:rtl w:val="0"/>
-          <w:lang w:val="en-US" w:eastAsia="ar-SA" w:bidi="ar-SA"/>
-        </w:rPr>
-        <w:t>‎A4‎</w:t>
-      </w:r>
-      <w:r>
-        <w:rPr>
-          <w:rFonts w:ascii="Tahoma" w:hAnsi="Tahoma" w:eastAsia="Tahoma" w:cs="Tahoma"/>
-          <w:color w:val="000000"/>
-          <w:rtl w:val="1"/>
-          <w:lang w:val="ar-SA" w:eastAsia="ar-SA" w:bidi="ar-SA"/>
-          <w:cs w:val="1"/>
-          <w:szCs w:val="22"/>
-        </w:rPr>
-        <w:t xml:space="preserve"> عمودي. عرض </w:t>
-      </w:r>
-      <w:r>
-        <w:rPr>
-          <w:rFonts w:ascii="Tahoma" w:hAnsi="Tahoma" w:eastAsia="Tahoma" w:cs="Tahoma"/>
-          <w:color w:val="000000"/>
-          <w:rtl w:val="0"/>
-          <w:lang w:val="en-US" w:eastAsia="ar-SA" w:bidi="ar-SA"/>
-        </w:rPr>
-        <w:t>‎PDF‎</w:t>
-      </w:r>
-      <w:r>
-        <w:rPr>
-          <w:rFonts w:ascii="Tahoma" w:hAnsi="Tahoma" w:eastAsia="Tahoma" w:cs="Tahoma"/>
-          <w:color w:val="000000"/>
-          <w:rtl w:val="1"/>
-          <w:lang w:val="ar-SA" w:eastAsia="ar-SA" w:bidi="ar-SA"/>
-          <w:cs w:val="1"/>
-          <w:szCs w:val="22"/>
-        </w:rPr>
-        <w:t xml:space="preserve"> الحراري ٨٠ مم وارتفاعه متغير حتى ١٠٠٠ مم للصفحة. يتحكم برنامج تشغيل الطابعة بحجم ورق المتصفح. افحص العينة والطلب الحقيقي و</w:t>
-      </w:r>
-      <w:r>
-        <w:rPr>
-          <w:rFonts w:ascii="Tahoma" w:hAnsi="Tahoma" w:eastAsia="Tahoma" w:cs="Tahoma"/>
-          <w:color w:val="000000"/>
-          <w:rtl w:val="0"/>
-          <w:lang w:val="en-US" w:eastAsia="ar-SA" w:bidi="ar-SA"/>
-        </w:rPr>
-        <w:t>‎RTL‎</w:t>
-      </w:r>
-      <w:r>
-        <w:rPr>
-          <w:rFonts w:ascii="Tahoma" w:hAnsi="Tahoma" w:eastAsia="Tahoma" w:cs="Tahoma"/>
-          <w:color w:val="000000"/>
-          <w:rtl w:val="1"/>
-          <w:lang w:val="ar-SA" w:eastAsia="ar-SA" w:bidi="ar-SA"/>
-          <w:cs w:val="1"/>
-          <w:szCs w:val="22"/>
-        </w:rPr>
-        <w:t xml:space="preserve"> واختبارا ورقيا قبل التشغيل التلقائي.</w:t>
+        </w:rPr>
+        <w:t>يستخدم ‎classic‎ و‎compact‎ ورق ‎A4‎ و‎classic-a5‎ ورق ‎A5.‎ صفحات ‎thermal‎ و‎thermal58‎ هي ٨٠ × ٢٩٧ و٥٨ × ٢٩٧ مم. ملصق الشحن ‎A6‎ وقائمة التعبئة ‎A4.‎ ورق المتصفح يتبع المشغّل. اختر ‎QR‎ لعرض ٥٨ مم واختبر الطباعة الفعلية.</w:t>
       </w:r>
     </w:p>
     <w:p>
@@ -2170,294 +2049,10 @@
       </w:pPr>
       <w:r>
         <w:rPr>
-          <w:rFonts w:ascii="Tahoma" w:hAnsi="Tahoma" w:eastAsia="Tahoma" w:cs="Tahoma"/>
-          <w:color w:val="000000"/>
+          <w:lang w:val="ar-SA" w:bidi="ar-SA"/>
           <w:rtl w:val="1"/>
-          <w:lang w:val="ar-SA" w:eastAsia="ar-SA" w:bidi="ar-SA"/>
-          <w:cs w:val="1"/>
-          <w:szCs w:val="22"/>
-        </w:rPr>
-        <w:t xml:space="preserve">يتلقى القالب </w:t>
-      </w:r>
-      <w:r>
-        <w:rPr>
-          <w:rFonts w:ascii="Courier New" w:hAnsi="Courier New" w:eastAsia="Courier New" w:cs="Courier New"/>
-          <w:color w:val="000000"/>
-          <w:rtl w:val="0"/>
-          <w:lang w:val="en-US" w:eastAsia="ar-SA" w:bidi="ar-SA"/>
-        </w:rPr>
-        <w:t>‎$invoice‎</w:t>
-      </w:r>
-      <w:r>
-        <w:rPr>
-          <w:rFonts w:ascii="Tahoma" w:hAnsi="Tahoma" w:eastAsia="Tahoma" w:cs="Tahoma"/>
-          <w:color w:val="000000"/>
-          <w:rtl w:val="1"/>
-          <w:lang w:val="ar-SA" w:eastAsia="ar-SA" w:bidi="ar-SA"/>
-          <w:cs w:val="1"/>
-          <w:szCs w:val="22"/>
-        </w:rPr>
-        <w:t xml:space="preserve"> و</w:t>
-      </w:r>
-      <w:r>
-        <w:rPr>
-          <w:rFonts w:ascii="Courier New" w:hAnsi="Courier New" w:eastAsia="Courier New" w:cs="Courier New"/>
-          <w:color w:val="000000"/>
-          <w:rtl w:val="0"/>
-          <w:lang w:val="en-US" w:eastAsia="ar-SA" w:bidi="ar-SA"/>
-        </w:rPr>
-        <w:t>‎$template.‎</w:t>
-      </w:r>
-      <w:r>
-        <w:rPr>
-          <w:rFonts w:ascii="Tahoma" w:hAnsi="Tahoma" w:eastAsia="Tahoma" w:cs="Tahoma"/>
-          <w:color w:val="000000"/>
-          <w:rtl w:val="1"/>
-          <w:lang w:val="ar-SA" w:eastAsia="ar-SA" w:bidi="ar-SA"/>
-          <w:cs w:val="1"/>
-          <w:szCs w:val="22"/>
-        </w:rPr>
-        <w:t xml:space="preserve"> حافظ على </w:t>
-      </w:r>
-      <w:r>
-        <w:rPr>
-          <w:rFonts w:ascii="Tahoma" w:hAnsi="Tahoma" w:eastAsia="Tahoma" w:cs="Tahoma"/>
-          <w:color w:val="000000"/>
-          <w:rtl w:val="0"/>
-          <w:lang w:val="en-US" w:eastAsia="ar-SA" w:bidi="ar-SA"/>
-        </w:rPr>
-        <w:t>‎ABSPATH‎</w:t>
-      </w:r>
-      <w:r>
-        <w:rPr>
-          <w:rFonts w:ascii="Tahoma" w:hAnsi="Tahoma" w:eastAsia="Tahoma" w:cs="Tahoma"/>
-          <w:color w:val="000000"/>
-          <w:rtl w:val="1"/>
-          <w:lang w:val="ar-SA" w:eastAsia="ar-SA" w:bidi="ar-SA"/>
-          <w:cs w:val="1"/>
-          <w:szCs w:val="22"/>
-        </w:rPr>
-        <w:t xml:space="preserve"> و</w:t>
-      </w:r>
-      <w:r>
-        <w:rPr>
-          <w:rFonts w:ascii="Tahoma" w:hAnsi="Tahoma" w:eastAsia="Tahoma" w:cs="Tahoma"/>
-          <w:color w:val="000000"/>
-          <w:rtl w:val="0"/>
-          <w:lang w:val="en-US" w:eastAsia="ar-SA" w:bidi="ar-SA"/>
-        </w:rPr>
-        <w:t>‎UTF-8‎</w:t>
-      </w:r>
-      <w:r>
-        <w:rPr>
-          <w:rFonts w:ascii="Tahoma" w:hAnsi="Tahoma" w:eastAsia="Tahoma" w:cs="Tahoma"/>
-          <w:color w:val="000000"/>
-          <w:rtl w:val="1"/>
-          <w:lang w:val="ar-SA" w:eastAsia="ar-SA" w:bidi="ar-SA"/>
-          <w:cs w:val="1"/>
-          <w:szCs w:val="22"/>
-        </w:rPr>
-        <w:t xml:space="preserve"> ووسم اللغة. اضبط </w:t>
-      </w:r>
-      <w:r>
-        <w:rPr>
-          <w:rFonts w:ascii="Tahoma" w:hAnsi="Tahoma" w:eastAsia="Tahoma" w:cs="Tahoma"/>
-          <w:color w:val="000000"/>
-          <w:rtl w:val="0"/>
-          <w:lang w:val="en-US" w:eastAsia="ar-SA" w:bidi="ar-SA"/>
-        </w:rPr>
-        <w:t>‎dir‎</w:t>
-      </w:r>
-      <w:r>
-        <w:rPr>
-          <w:rFonts w:ascii="Tahoma" w:hAnsi="Tahoma" w:eastAsia="Tahoma" w:cs="Tahoma"/>
-          <w:color w:val="000000"/>
-          <w:rtl w:val="1"/>
-          <w:lang w:val="ar-SA" w:eastAsia="ar-SA" w:bidi="ar-SA"/>
-          <w:cs w:val="1"/>
-          <w:szCs w:val="22"/>
-        </w:rPr>
-        <w:t xml:space="preserve"> و</w:t>
-      </w:r>
-      <w:r>
-        <w:rPr>
-          <w:rFonts w:ascii="Tahoma" w:hAnsi="Tahoma" w:eastAsia="Tahoma" w:cs="Tahoma"/>
-          <w:color w:val="000000"/>
-          <w:rtl w:val="0"/>
-          <w:lang w:val="en-US" w:eastAsia="ar-SA" w:bidi="ar-SA"/>
-        </w:rPr>
-        <w:t>‎direction‎</w:t>
-      </w:r>
-      <w:r>
-        <w:rPr>
-          <w:rFonts w:ascii="Tahoma" w:hAnsi="Tahoma" w:eastAsia="Tahoma" w:cs="Tahoma"/>
-          <w:color w:val="000000"/>
-          <w:rtl w:val="1"/>
-          <w:lang w:val="ar-SA" w:eastAsia="ar-SA" w:bidi="ar-SA"/>
-          <w:cs w:val="1"/>
-          <w:szCs w:val="22"/>
-        </w:rPr>
-        <w:t xml:space="preserve"> من </w:t>
-      </w:r>
-      <w:r>
-        <w:rPr>
-          <w:rFonts w:ascii="Courier New" w:hAnsi="Courier New" w:eastAsia="Courier New" w:cs="Courier New"/>
-          <w:color w:val="000000"/>
-          <w:rtl w:val="0"/>
-          <w:lang w:val="en-US" w:eastAsia="ar-SA" w:bidi="ar-SA"/>
-        </w:rPr>
-        <w:t>‎$invoice-&gt;rtl‎</w:t>
-      </w:r>
-      <w:r>
-        <w:rPr>
-          <w:rFonts w:ascii="Tahoma" w:hAnsi="Tahoma" w:eastAsia="Tahoma" w:cs="Tahoma"/>
-          <w:color w:val="000000"/>
-          <w:rtl w:val="1"/>
-          <w:lang w:val="ar-SA" w:eastAsia="ar-SA" w:bidi="ar-SA"/>
-          <w:cs w:val="1"/>
-          <w:szCs w:val="22"/>
-        </w:rPr>
-        <w:t xml:space="preserve"> واعكس المحاذاة والهوامش، واعزل البريد والهاتف و</w:t>
-      </w:r>
-      <w:r>
-        <w:rPr>
-          <w:rFonts w:ascii="Tahoma" w:hAnsi="Tahoma" w:eastAsia="Tahoma" w:cs="Tahoma"/>
-          <w:color w:val="000000"/>
-          <w:rtl w:val="0"/>
-          <w:lang w:val="en-US" w:eastAsia="ar-SA" w:bidi="ar-SA"/>
-        </w:rPr>
-        <w:t>‎SKU‎</w:t>
-      </w:r>
-      <w:r>
-        <w:rPr>
-          <w:rFonts w:ascii="Tahoma" w:hAnsi="Tahoma" w:eastAsia="Tahoma" w:cs="Tahoma"/>
-          <w:color w:val="000000"/>
-          <w:rtl w:val="1"/>
-          <w:lang w:val="ar-SA" w:eastAsia="ar-SA" w:bidi="ar-SA"/>
-          <w:cs w:val="1"/>
-          <w:szCs w:val="22"/>
-        </w:rPr>
-        <w:t xml:space="preserve"> باتجاه </w:t>
-      </w:r>
-      <w:r>
-        <w:rPr>
-          <w:rFonts w:ascii="Tahoma" w:hAnsi="Tahoma" w:eastAsia="Tahoma" w:cs="Tahoma"/>
-          <w:color w:val="000000"/>
-          <w:rtl w:val="0"/>
-          <w:lang w:val="en-US" w:eastAsia="ar-SA" w:bidi="ar-SA"/>
-        </w:rPr>
-        <w:t>‎LTR.‎</w:t>
-      </w:r>
-      <w:r>
-        <w:rPr>
-          <w:rFonts w:ascii="Tahoma" w:hAnsi="Tahoma" w:eastAsia="Tahoma" w:cs="Tahoma"/>
-          <w:color w:val="000000"/>
-          <w:rtl w:val="1"/>
-          <w:lang w:val="ar-SA" w:eastAsia="ar-SA" w:bidi="ar-SA"/>
-          <w:cs w:val="1"/>
-          <w:szCs w:val="22"/>
-        </w:rPr>
-        <w:t xml:space="preserve"> اختبر </w:t>
-      </w:r>
-      <w:r>
-        <w:rPr>
-          <w:rFonts w:ascii="Tahoma" w:hAnsi="Tahoma" w:eastAsia="Tahoma" w:cs="Tahoma"/>
-          <w:color w:val="000000"/>
-          <w:rtl w:val="0"/>
-          <w:lang w:val="en-US" w:eastAsia="ar-SA" w:bidi="ar-SA"/>
-        </w:rPr>
-        <w:t>‎CSS‎</w:t>
-      </w:r>
-      <w:r>
-        <w:rPr>
-          <w:rFonts w:ascii="Tahoma" w:hAnsi="Tahoma" w:eastAsia="Tahoma" w:cs="Tahoma"/>
-          <w:color w:val="000000"/>
-          <w:rtl w:val="1"/>
-          <w:lang w:val="ar-SA" w:eastAsia="ar-SA" w:bidi="ar-SA"/>
-          <w:cs w:val="1"/>
-          <w:szCs w:val="22"/>
-        </w:rPr>
-        <w:t xml:space="preserve"> البسيط في المتصفح و</w:t>
-      </w:r>
-      <w:r>
-        <w:rPr>
-          <w:rFonts w:ascii="Tahoma" w:hAnsi="Tahoma" w:eastAsia="Tahoma" w:cs="Tahoma"/>
-          <w:color w:val="000000"/>
-          <w:rtl w:val="0"/>
-          <w:lang w:val="en-US" w:eastAsia="ar-SA" w:bidi="ar-SA"/>
-        </w:rPr>
-        <w:t>‎mPDF.‎</w:t>
-      </w:r>
-      <w:r>
-        <w:rPr>
-          <w:rFonts w:ascii="Tahoma" w:hAnsi="Tahoma" w:eastAsia="Tahoma" w:cs="Tahoma"/>
-          <w:color w:val="000000"/>
-          <w:rtl w:val="1"/>
-          <w:lang w:val="ar-SA" w:eastAsia="ar-SA" w:bidi="ar-SA"/>
-          <w:cs w:val="1"/>
-          <w:szCs w:val="22"/>
-        </w:rPr>
-        <w:t xml:space="preserve"> احتفظ بعلامة </w:t>
-      </w:r>
-      <w:r>
-        <w:rPr>
-          <w:rFonts w:ascii="Tahoma" w:hAnsi="Tahoma" w:eastAsia="Tahoma" w:cs="Tahoma"/>
-          <w:color w:val="000000"/>
-          <w:rtl w:val="0"/>
-          <w:lang w:val="en-US" w:eastAsia="ar-SA" w:bidi="ar-SA"/>
-        </w:rPr>
-        <w:t>‎class=‎</w:t>
-      </w:r>
-      <w:r>
-        <w:rPr>
-          <w:rFonts w:ascii="Tahoma" w:hAnsi="Tahoma" w:eastAsia="Tahoma" w:cs="Tahoma"/>
-          <w:color w:val="000000"/>
-          <w:rtl w:val="1"/>
-          <w:lang w:val="ar-SA" w:eastAsia="ar-SA" w:bidi="ar-SA"/>
-          <w:cs w:val="1"/>
-          <w:szCs w:val="22"/>
-        </w:rPr>
-        <w:t>"</w:t>
-      </w:r>
-      <w:r>
-        <w:rPr>
-          <w:rFonts w:ascii="Tahoma" w:hAnsi="Tahoma" w:eastAsia="Tahoma" w:cs="Tahoma"/>
-          <w:color w:val="000000"/>
-          <w:rtl w:val="0"/>
-          <w:lang w:val="en-US" w:eastAsia="ar-SA" w:bidi="ar-SA"/>
-        </w:rPr>
-        <w:t>‎item‎</w:t>
-      </w:r>
-      <w:r>
-        <w:rPr>
-          <w:rFonts w:ascii="Tahoma" w:hAnsi="Tahoma" w:eastAsia="Tahoma" w:cs="Tahoma"/>
-          <w:color w:val="000000"/>
-          <w:rtl w:val="1"/>
-          <w:lang w:val="ar-SA" w:eastAsia="ar-SA" w:bidi="ar-SA"/>
-          <w:cs w:val="1"/>
-          <w:szCs w:val="22"/>
-        </w:rPr>
-        <w:t xml:space="preserve">" في قالب </w:t>
-      </w:r>
-      <w:r>
-        <w:rPr>
-          <w:rFonts w:ascii="Tahoma" w:hAnsi="Tahoma" w:eastAsia="Tahoma" w:cs="Tahoma"/>
-          <w:color w:val="000000"/>
-          <w:rtl w:val="0"/>
-          <w:lang w:val="en-US" w:eastAsia="ar-SA" w:bidi="ar-SA"/>
-        </w:rPr>
-        <w:t>‎80mm‎</w:t>
-      </w:r>
-      <w:r>
-        <w:rPr>
-          <w:rFonts w:ascii="Tahoma" w:hAnsi="Tahoma" w:eastAsia="Tahoma" w:cs="Tahoma"/>
-          <w:color w:val="000000"/>
-          <w:rtl w:val="1"/>
-          <w:lang w:val="ar-SA" w:eastAsia="ar-SA" w:bidi="ar-SA"/>
-          <w:cs w:val="1"/>
-          <w:szCs w:val="22"/>
-        </w:rPr>
-        <w:t xml:space="preserve"> لحساب ارتفاع الإيصال.</w:t>
+        </w:rPr>
+        <w:t xml:space="preserve">يتلقى القالب ‎‎$invoice‎‎ و‎‎$template.‎ ‎ حافظ على ‎‎ABSPATH‎‎ و‎‎UTF-8‎‎ ووسم اللغة. اضبط ‎‎dir‎‎ و‎‎direction‎‎ من ‎‎$invoice-&gt;rtl‎‎ واعكس المحاذاة والهوامش، واعزل البريد والهاتف و‎‎SKU‎‎ باتجاه ‎‎LTR.‎ ‎ اختبر ‎‎CSS‎‎ البسيط في المتصفح و‎‎mPDF.‎ </w:t>
       </w:r>
     </w:p>
     <w:p>
@@ -2804,7 +2399,7 @@
               <w:left w:w="100" w:type="dxa"/>
               <w:right w:w="100" w:type="dxa"/>
             </w:tcMar>
-            <w:shd w:fill="E7EDF2"/>
+            <w:shd w:fill="D9D9D9" w:val="clear"/>
           </w:tcPr>
           <w:p>
             <w:pPr>
@@ -2838,7 +2433,7 @@
               <w:left w:w="100" w:type="dxa"/>
               <w:right w:w="100" w:type="dxa"/>
             </w:tcMar>
-            <w:shd w:fill="E7EDF2"/>
+            <w:shd w:fill="D9D9D9" w:val="clear"/>
           </w:tcPr>
           <w:p>
             <w:pPr>
@@ -2911,17 +2506,12 @@
           <w:p>
             <w:pPr>
               <w:bidi w:val="0"/>
-              <w:spacing w:after="0" w:line="269" w:lineRule="auto"/>
-              <w:jc w:val="left"/>
+              <w:jc w:val="start"/>
             </w:pPr>
             <w:r>
               <w:rPr>
-                <w:rFonts w:ascii="Courier New" w:hAnsi="Courier New" w:eastAsia="Courier New" w:cs="Courier New"/>
-                <w:b w:val="0"/>
-                <w:color w:val="000000"/>
-                <w:sz w:val="18"/>
+                <w:lang w:val="ar-SA" w:bidi="ar-SA"/>
                 <w:rtl w:val="0"/>
-                <w:lang w:val="en-US" w:eastAsia="ar-SA" w:bidi="ar-SA"/>
               </w:rPr>
               <w:t>id, number, date, paid_date, currency, status</w:t>
             </w:r>
@@ -3041,19 +2631,14 @@
           <w:p>
             <w:pPr>
               <w:bidi w:val="0"/>
-              <w:spacing w:after="0" w:line="269" w:lineRule="auto"/>
-              <w:jc w:val="left"/>
+              <w:jc w:val="start"/>
             </w:pPr>
             <w:r>
               <w:rPr>
-                <w:rFonts w:ascii="Courier New" w:hAnsi="Courier New" w:eastAsia="Courier New" w:cs="Courier New"/>
-                <w:b w:val="0"/>
-                <w:color w:val="000000"/>
-                <w:sz w:val="18"/>
+                <w:lang w:val="ar-SA" w:bidi="ar-SA"/>
                 <w:rtl w:val="0"/>
-                <w:lang w:val="en-US" w:eastAsia="ar-SA" w:bidi="ar-SA"/>
               </w:rPr>
-              <w:t>name, company, billing_address, shipping_address, phone, email</w:t>
+              <w:t>name, company, billing_address, shipping_address, phone, shipping_phone, email, recipient, billing_components</w:t>
             </w:r>
           </w:p>
         </w:tc>
@@ -3106,19 +2691,14 @@
           <w:p>
             <w:pPr>
               <w:bidi w:val="0"/>
-              <w:spacing w:after="0" w:line="269" w:lineRule="auto"/>
-              <w:jc w:val="left"/>
+              <w:jc w:val="start"/>
             </w:pPr>
             <w:r>
               <w:rPr>
-                <w:rFonts w:ascii="Courier New" w:hAnsi="Courier New" w:eastAsia="Courier New" w:cs="Courier New"/>
-                <w:b w:val="0"/>
-                <w:color w:val="000000"/>
-                <w:sz w:val="18"/>
+                <w:lang w:val="ar-SA" w:bidi="ar-SA"/>
                 <w:rtl w:val="0"/>
-                <w:lang w:val="en-US" w:eastAsia="ar-SA" w:bidi="ar-SA"/>
               </w:rPr>
-              <w:t>name, variation, sku, quantity, unit_price, subtotal, discount, tax, total</w:t>
+              <w:t>item_id, product_id, variation_id, name, variation, sku, quantity, refunded_quantity, weight, unit_price, subtotal, discount, tax, total</w:t>
             </w:r>
           </w:p>
         </w:tc>
@@ -3236,19 +2816,14 @@
           <w:p>
             <w:pPr>
               <w:bidi w:val="0"/>
-              <w:spacing w:after="0" w:line="269" w:lineRule="auto"/>
-              <w:jc w:val="left"/>
+              <w:jc w:val="start"/>
             </w:pPr>
             <w:r>
               <w:rPr>
-                <w:rFonts w:ascii="Courier New" w:hAnsi="Courier New" w:eastAsia="Courier New" w:cs="Courier New"/>
-                <w:b w:val="0"/>
-                <w:color w:val="000000"/>
-                <w:sz w:val="18"/>
+                <w:lang w:val="ar-SA" w:bidi="ar-SA"/>
                 <w:rtl w:val="0"/>
-                <w:lang w:val="en-US" w:eastAsia="ar-SA" w:bidi="ar-SA"/>
               </w:rPr>
-              <w:t>payment_method, shipping_method, note</w:t>
+              <w:t>payment_method, shipping_method, note, payment_confirmed, show_paid_date, show_shipping_phone, label_show_sender, document_codes</w:t>
             </w:r>
           </w:p>
         </w:tc>
@@ -3734,7 +3309,7 @@
               <w:left w:w="100" w:type="dxa"/>
               <w:right w:w="100" w:type="dxa"/>
             </w:tcMar>
-            <w:shd w:fill="E7EDF2"/>
+            <w:shd w:fill="D9D9D9" w:val="clear"/>
           </w:tcPr>
           <w:p>
             <w:pPr>
@@ -3768,7 +3343,7 @@
               <w:left w:w="100" w:type="dxa"/>
               <w:right w:w="100" w:type="dxa"/>
             </w:tcMar>
-            <w:shd w:fill="E7EDF2"/>
+            <w:shd w:fill="D9D9D9" w:val="clear"/>
           </w:tcPr>
           <w:p>
             <w:pPr>
@@ -5152,163 +4727,12 @@
       </w:pPr>
       <w:r>
         <w:rPr>
-          <w:rFonts w:ascii="Tahoma" w:hAnsi="Tahoma" w:eastAsia="Tahoma" w:cs="Tahoma"/>
+          <w:lang w:val="ar-SA" w:bidi="ar-SA" w:eastAsia="ar-SA"/>
           <w:color w:val="000000"/>
           <w:rtl w:val="1"/>
-          <w:lang w:val="ar-SA" w:eastAsia="ar-SA" w:bidi="ar-SA"/>
-          <w:cs w:val="1"/>
-          <w:szCs w:val="22"/>
-        </w:rPr>
-        <w:t>التسجيل وحده لا يتيح اختيار مزود جديد. الإعدادات والتشغيل التلقائي و</w:t>
-      </w:r>
-      <w:r>
-        <w:rPr>
-          <w:rFonts w:ascii="Tahoma" w:hAnsi="Tahoma" w:eastAsia="Tahoma" w:cs="Tahoma"/>
-          <w:color w:val="000000"/>
-          <w:rtl w:val="0"/>
-          <w:lang w:val="en-US" w:eastAsia="ar-SA" w:bidi="ar-SA"/>
-        </w:rPr>
-        <w:t>‎REST‎</w:t>
-      </w:r>
-      <w:r>
-        <w:rPr>
-          <w:rFonts w:ascii="Tahoma" w:hAnsi="Tahoma" w:eastAsia="Tahoma" w:cs="Tahoma"/>
-          <w:color w:val="000000"/>
-          <w:rtl w:val="1"/>
-          <w:lang w:val="ar-SA" w:eastAsia="ar-SA" w:bidi="ar-SA"/>
-          <w:cs w:val="1"/>
-          <w:szCs w:val="22"/>
-        </w:rPr>
-        <w:t xml:space="preserve"> </w:t>
-      </w:r>
-      <w:r>
-        <w:rPr>
-          <w:rFonts w:ascii="Courier New" w:hAnsi="Courier New" w:eastAsia="Courier New" w:cs="Courier New"/>
-          <w:color w:val="000000"/>
-          <w:rtl w:val="0"/>
-          <w:lang w:val="en-US" w:eastAsia="ar-SA" w:bidi="ar-SA"/>
-        </w:rPr>
-        <w:t>‎/print‎</w:t>
-      </w:r>
-      <w:r>
-        <w:rPr>
-          <w:rFonts w:ascii="Tahoma" w:hAnsi="Tahoma" w:eastAsia="Tahoma" w:cs="Tahoma"/>
-          <w:color w:val="000000"/>
-          <w:rtl w:val="1"/>
-          <w:lang w:val="ar-SA" w:eastAsia="ar-SA" w:bidi="ar-SA"/>
-          <w:cs w:val="1"/>
-          <w:szCs w:val="22"/>
-        </w:rPr>
-        <w:t xml:space="preserve"> مرتبطة بـ</w:t>
-      </w:r>
-      <w:r>
-        <w:rPr>
-          <w:rFonts w:ascii="Tahoma" w:hAnsi="Tahoma" w:eastAsia="Tahoma" w:cs="Tahoma"/>
-          <w:color w:val="000000"/>
-          <w:rtl w:val="0"/>
-          <w:lang w:val="en-US" w:eastAsia="ar-SA" w:bidi="ar-SA"/>
-        </w:rPr>
-        <w:t>‎PrintNode‎</w:t>
-      </w:r>
-      <w:r>
-        <w:rPr>
-          <w:rFonts w:ascii="Tahoma" w:hAnsi="Tahoma" w:eastAsia="Tahoma" w:cs="Tahoma"/>
-          <w:color w:val="000000"/>
-          <w:rtl w:val="1"/>
-          <w:lang w:val="ar-SA" w:eastAsia="ar-SA" w:bidi="ar-SA"/>
-          <w:cs w:val="1"/>
-          <w:szCs w:val="22"/>
-        </w:rPr>
-        <w:t xml:space="preserve">؛ يقبل </w:t>
-      </w:r>
-      <w:r>
-        <w:rPr>
-          <w:rFonts w:ascii="Courier New" w:hAnsi="Courier New" w:eastAsia="Courier New" w:cs="Courier New"/>
-          <w:color w:val="000000"/>
-          <w:rtl w:val="0"/>
-          <w:lang w:val="en-US" w:eastAsia="ar-SA" w:bidi="ar-SA"/>
-        </w:rPr>
-        <w:t>‎create_manual‎</w:t>
-      </w:r>
-      <w:r>
-        <w:rPr>
-          <w:rFonts w:ascii="Tahoma" w:hAnsi="Tahoma" w:eastAsia="Tahoma" w:cs="Tahoma"/>
-          <w:color w:val="000000"/>
-          <w:rtl w:val="1"/>
-          <w:lang w:val="ar-SA" w:eastAsia="ar-SA" w:bidi="ar-SA"/>
-          <w:cs w:val="1"/>
-          <w:szCs w:val="22"/>
-        </w:rPr>
-        <w:t xml:space="preserve"> فقط </w:t>
-      </w:r>
-      <w:r>
-        <w:rPr>
-          <w:rFonts w:ascii="Tahoma" w:hAnsi="Tahoma" w:eastAsia="Tahoma" w:cs="Tahoma"/>
-          <w:color w:val="000000"/>
-          <w:rtl w:val="0"/>
-          <w:lang w:val="en-US" w:eastAsia="ar-SA" w:bidi="ar-SA"/>
-        </w:rPr>
-        <w:t>‎browser‎</w:t>
-      </w:r>
-      <w:r>
-        <w:rPr>
-          <w:rFonts w:ascii="Tahoma" w:hAnsi="Tahoma" w:eastAsia="Tahoma" w:cs="Tahoma"/>
-          <w:color w:val="000000"/>
-          <w:rtl w:val="1"/>
-          <w:lang w:val="ar-SA" w:eastAsia="ar-SA" w:bidi="ar-SA"/>
-          <w:cs w:val="1"/>
-          <w:szCs w:val="22"/>
-        </w:rPr>
-        <w:t xml:space="preserve"> و</w:t>
-      </w:r>
-      <w:r>
-        <w:rPr>
-          <w:rFonts w:ascii="Tahoma" w:hAnsi="Tahoma" w:eastAsia="Tahoma" w:cs="Tahoma"/>
-          <w:color w:val="000000"/>
-          <w:rtl w:val="0"/>
-          <w:lang w:val="en-US" w:eastAsia="ar-SA" w:bidi="ar-SA"/>
-        </w:rPr>
-        <w:t>‎printnode.‎</w:t>
-      </w:r>
-      <w:r>
-        <w:rPr>
-          <w:rFonts w:ascii="Tahoma" w:hAnsi="Tahoma" w:eastAsia="Tahoma" w:cs="Tahoma"/>
-          <w:color w:val="000000"/>
-          <w:rtl w:val="1"/>
-          <w:lang w:val="ar-SA" w:eastAsia="ar-SA" w:bidi="ar-SA"/>
-          <w:cs w:val="1"/>
-          <w:szCs w:val="22"/>
-        </w:rPr>
-        <w:t xml:space="preserve"> يحتاج المزود الجديد إلى تعديل التحقق وإنشاء المهام والإعدادات والصلاحيات والواجهة والاختبارات. استبدال مدخل </w:t>
-      </w:r>
-      <w:r>
-        <w:rPr>
-          <w:rFonts w:ascii="Tahoma" w:hAnsi="Tahoma" w:eastAsia="Tahoma" w:cs="Tahoma"/>
-          <w:color w:val="000000"/>
-          <w:rtl w:val="0"/>
-          <w:lang w:val="en-US" w:eastAsia="ar-SA" w:bidi="ar-SA"/>
-        </w:rPr>
-        <w:t>‎printnode‎</w:t>
-      </w:r>
-      <w:r>
-        <w:rPr>
-          <w:rFonts w:ascii="Tahoma" w:hAnsi="Tahoma" w:eastAsia="Tahoma" w:cs="Tahoma"/>
-          <w:color w:val="000000"/>
-          <w:rtl w:val="1"/>
-          <w:lang w:val="ar-SA" w:eastAsia="ar-SA" w:bidi="ar-SA"/>
-          <w:cs w:val="1"/>
-          <w:szCs w:val="22"/>
-        </w:rPr>
-        <w:t xml:space="preserve"> يبقي قيوده. لا توجد نقطة عامة لاستبدال محرك </w:t>
-      </w:r>
-      <w:r>
-        <w:rPr>
-          <w:rFonts w:ascii="Tahoma" w:hAnsi="Tahoma" w:eastAsia="Tahoma" w:cs="Tahoma"/>
-          <w:color w:val="000000"/>
-          <w:rtl w:val="0"/>
-          <w:lang w:val="en-US" w:eastAsia="ar-SA" w:bidi="ar-SA"/>
-        </w:rPr>
-        <w:t>‎PDF.‎</w:t>
+          <w:rFonts w:ascii="Arial" w:hAnsi="Arial" w:eastAsia="Arial" w:cs="Arial"/>
+        </w:rPr>
+        <w:t>الوجهات المدمجة هي ‎browser‎ و‎cups‎ و‎agent.‎ تسجيل مزود إرسال مباشر لا يضيف إعدادات أو خيارا للاختيار؛ طور التحقق والواجهة وإنشاء المهام والاختبارات معا. يستخدم وكيل السحب ‎AgentQueue‎ و‎AgentController‎ بدلا من ‎PrintProviderInterface.‎ لا يوجد خطاف عام لاستبدال محرك ‎PDF.‎</w:t>
       </w:r>
     </w:p>
     <w:p>
@@ -5318,134 +4742,12 @@
       </w:pPr>
       <w:r>
         <w:rPr>
-          <w:rFonts w:ascii="Tahoma" w:hAnsi="Tahoma" w:eastAsia="Tahoma" w:cs="Tahoma"/>
+          <w:lang w:val="ar-SA" w:bidi="ar-SA" w:eastAsia="ar-SA"/>
           <w:color w:val="000000"/>
           <w:rtl w:val="1"/>
-          <w:lang w:val="ar-SA" w:eastAsia="ar-SA" w:bidi="ar-SA"/>
-          <w:cs w:val="1"/>
-          <w:szCs w:val="22"/>
-        </w:rPr>
-        <w:t xml:space="preserve">المسار </w:t>
-      </w:r>
-      <w:r>
-        <w:rPr>
-          <w:rFonts w:ascii="Courier New" w:hAnsi="Courier New" w:eastAsia="Courier New" w:cs="Courier New"/>
-          <w:color w:val="000000"/>
-          <w:rtl w:val="0"/>
-          <w:lang w:val="en-US" w:eastAsia="ar-SA" w:bidi="ar-SA"/>
-        </w:rPr>
-        <w:t>‎/wp-json/wc-invoice-printer/v1.‎</w:t>
-      </w:r>
-      <w:r>
-        <w:rPr>
-          <w:rFonts w:ascii="Tahoma" w:hAnsi="Tahoma" w:eastAsia="Tahoma" w:cs="Tahoma"/>
-          <w:color w:val="000000"/>
-          <w:rtl w:val="1"/>
-          <w:lang w:val="ar-SA" w:eastAsia="ar-SA" w:bidi="ar-SA"/>
-          <w:cs w:val="1"/>
-          <w:szCs w:val="22"/>
-        </w:rPr>
-        <w:t xml:space="preserve"> يلزم مستخدم مخول و</w:t>
-      </w:r>
-      <w:r>
-        <w:rPr>
-          <w:rFonts w:ascii="Tahoma" w:hAnsi="Tahoma" w:eastAsia="Tahoma" w:cs="Tahoma"/>
-          <w:color w:val="000000"/>
-          <w:rtl w:val="0"/>
-          <w:lang w:val="en-US" w:eastAsia="ar-SA" w:bidi="ar-SA"/>
-        </w:rPr>
-        <w:t>‎X-WP-Nonce‎</w:t>
-      </w:r>
-      <w:r>
-        <w:rPr>
-          <w:rFonts w:ascii="Tahoma" w:hAnsi="Tahoma" w:eastAsia="Tahoma" w:cs="Tahoma"/>
-          <w:color w:val="000000"/>
-          <w:rtl w:val="1"/>
-          <w:lang w:val="ar-SA" w:eastAsia="ar-SA" w:bidi="ar-SA"/>
-          <w:cs w:val="1"/>
-          <w:szCs w:val="22"/>
-        </w:rPr>
-        <w:t xml:space="preserve"> من </w:t>
-      </w:r>
-      <w:r>
-        <w:rPr>
-          <w:rFonts w:ascii="Courier New" w:hAnsi="Courier New" w:eastAsia="Courier New" w:cs="Courier New"/>
-          <w:color w:val="000000"/>
-          <w:rtl w:val="0"/>
-          <w:lang w:val="en-US" w:eastAsia="ar-SA" w:bidi="ar-SA"/>
-        </w:rPr>
-        <w:t>‎wp_create_nonce('wp_rest')‎</w:t>
-      </w:r>
-      <w:r>
-        <w:rPr>
-          <w:rFonts w:ascii="Tahoma" w:hAnsi="Tahoma" w:eastAsia="Tahoma" w:cs="Tahoma"/>
-          <w:color w:val="000000"/>
-          <w:rtl w:val="1"/>
-          <w:lang w:val="ar-SA" w:eastAsia="ar-SA" w:bidi="ar-SA"/>
-          <w:cs w:val="1"/>
-          <w:szCs w:val="22"/>
-        </w:rPr>
-        <w:t xml:space="preserve"> لمصادقة المتصفح بالكوكيز. أضف </w:t>
-      </w:r>
-      <w:r>
-        <w:rPr>
-          <w:rFonts w:ascii="Courier New" w:hAnsi="Courier New" w:eastAsia="Courier New" w:cs="Courier New"/>
-          <w:color w:val="000000"/>
-          <w:rtl w:val="0"/>
-          <w:lang w:val="en-US" w:eastAsia="ar-SA" w:bidi="ar-SA"/>
-        </w:rPr>
-        <w:t>‎_locale=user‎</w:t>
-      </w:r>
-      <w:r>
-        <w:rPr>
-          <w:rFonts w:ascii="Tahoma" w:hAnsi="Tahoma" w:eastAsia="Tahoma" w:cs="Tahoma"/>
-          <w:color w:val="000000"/>
-          <w:rtl w:val="1"/>
-          <w:lang w:val="ar-SA" w:eastAsia="ar-SA" w:bidi="ar-SA"/>
-          <w:cs w:val="1"/>
-          <w:szCs w:val="22"/>
-        </w:rPr>
-        <w:t xml:space="preserve"> للغة المستخدم. يقبل الطلب ١–٥٠ طلبا و١–٢٠ نسخة وقالبا مسجلا ومعرف طابعة نصيا رقميا موجبا. يعني </w:t>
-      </w:r>
-      <w:r>
-        <w:rPr>
-          <w:rFonts w:ascii="Tahoma" w:hAnsi="Tahoma" w:eastAsia="Tahoma" w:cs="Tahoma"/>
-          <w:color w:val="000000"/>
-          <w:rtl w:val="0"/>
-          <w:lang w:val="en-US" w:eastAsia="ar-SA" w:bidi="ar-SA"/>
-        </w:rPr>
-        <w:t>‎201‎</w:t>
-      </w:r>
-      <w:r>
-        <w:rPr>
-          <w:rFonts w:ascii="Tahoma" w:hAnsi="Tahoma" w:eastAsia="Tahoma" w:cs="Tahoma"/>
-          <w:color w:val="000000"/>
-          <w:rtl w:val="1"/>
-          <w:lang w:val="ar-SA" w:eastAsia="ar-SA" w:bidi="ar-SA"/>
-          <w:cs w:val="1"/>
-          <w:szCs w:val="22"/>
-        </w:rPr>
-        <w:t xml:space="preserve"> وضع المهمة في الصف؛ التكرار اليدوي ينشئ مهاما جديدة. راجع </w:t>
-      </w:r>
-      <w:r>
-        <w:rPr>
-          <w:rFonts w:ascii="Courier New" w:hAnsi="Courier New" w:eastAsia="Courier New" w:cs="Courier New"/>
-          <w:color w:val="000000"/>
-          <w:rtl w:val="0"/>
-          <w:lang w:val="en-US" w:eastAsia="ar-SA" w:bidi="ar-SA"/>
-        </w:rPr>
-        <w:t>‎job_ids‎</w:t>
-      </w:r>
-      <w:r>
-        <w:rPr>
-          <w:rFonts w:ascii="Tahoma" w:hAnsi="Tahoma" w:eastAsia="Tahoma" w:cs="Tahoma"/>
-          <w:color w:val="000000"/>
-          <w:rtl w:val="1"/>
-          <w:lang w:val="ar-SA" w:eastAsia="ar-SA" w:bidi="ar-SA"/>
-          <w:cs w:val="1"/>
-          <w:szCs w:val="22"/>
-        </w:rPr>
-        <w:t xml:space="preserve"> عند الفشل الجزئي.</w:t>
+          <w:rFonts w:ascii="Arial" w:hAnsi="Arial" w:eastAsia="Arial" w:cs="Arial"/>
+        </w:rPr>
+        <w:t>يقبل ‎POST‎ /‎print‎ من ١ إلى ٥٠ معرف طلب وقالبا مسجلا ومن ١ إلى ٢٠ نسخة. أرسل اسم صف ‎CUPS‎ الدقيق مع ‎cups‎ أو الصف المنطقي المرتبط مع ‎agent.‎ تعني 201 الانتظار في الصف. تتطلب مصادقة ملفات الارتباط ‎REST‎ ‎nonce.‎ التكرار اليدوي ينشئ مهاما جديدة؛ راجع ‎job_ids‎ قبل إعادة دفعة جزئية.</w:t>
       </w:r>
     </w:p>
     <w:tbl>
@@ -5483,7 +4785,7 @@
               <w:left w:w="100" w:type="dxa"/>
               <w:right w:w="100" w:type="dxa"/>
             </w:tcMar>
-            <w:shd w:fill="E7EDF2"/>
+            <w:shd w:fill="D9D9D9" w:val="clear"/>
           </w:tcPr>
           <w:p>
             <w:pPr>
@@ -5517,7 +4819,7 @@
               <w:left w:w="100" w:type="dxa"/>
               <w:right w:w="100" w:type="dxa"/>
             </w:tcMar>
-            <w:shd w:fill="E7EDF2"/>
+            <w:shd w:fill="D9D9D9" w:val="clear"/>
           </w:tcPr>
           <w:p>
             <w:pPr>
@@ -6063,17 +5365,14 @@
         <w:pStyle w:val="Code"/>
         <w:keepNext/>
         <w:bidi w:val="0"/>
-        <w:jc w:val="left"/>
+        <w:jc w:val="start"/>
       </w:pPr>
       <w:r>
         <w:rPr>
-          <w:rFonts w:ascii="Courier New" w:hAnsi="Courier New" w:eastAsia="Courier New" w:cs="Courier New"/>
-          <w:color w:val="000000"/>
-          <w:sz w:val="18"/>
+          <w:lang w:val="ar-SA" w:bidi="ar-SA"/>
           <w:rtl w:val="0"/>
-          <w:lang w:val="en-US" w:eastAsia="ar-SA" w:bidi="ar-SA"/>
-        </w:rPr>
-        <w:t xml:space="preserve">  "provider_id": "printnode", "printer_id": "12345",</w:t>
+        </w:rPr>
+        <w:t xml:space="preserve">  "provider_id": "cups", "printer_id": "Office_A4",</w:t>
       </w:r>
     </w:p>
     <w:p>
@@ -6180,34 +5479,12 @@
       </w:pPr>
       <w:r>
         <w:rPr>
-          <w:rFonts w:ascii="Tahoma" w:hAnsi="Tahoma" w:eastAsia="Tahoma" w:cs="Tahoma"/>
+          <w:lang w:val="ar-SA" w:bidi="ar-SA" w:eastAsia="ar-SA"/>
           <w:color w:val="000000"/>
           <w:rtl w:val="1"/>
-          <w:lang w:val="ar-SA" w:eastAsia="ar-SA" w:bidi="ar-SA"/>
-          <w:cs w:val="1"/>
-          <w:szCs w:val="22"/>
-        </w:rPr>
-        <w:t xml:space="preserve">الطباعة التلقائية معطلة افتراضيا. احفظ المفتاح واختبر الاتصال وحدّث الطابعات واختر جهازا واطبع عينة ثم فعّل التشغيل. يجب أن يعمل عميل </w:t>
-      </w:r>
-      <w:r>
-        <w:rPr>
-          <w:rFonts w:ascii="Tahoma" w:hAnsi="Tahoma" w:eastAsia="Tahoma" w:cs="Tahoma"/>
-          <w:color w:val="000000"/>
-          <w:rtl w:val="0"/>
-          <w:lang w:val="en-US" w:eastAsia="ar-SA" w:bidi="ar-SA"/>
-        </w:rPr>
-        <w:t>‎PrintNode‎</w:t>
-      </w:r>
-      <w:r>
-        <w:rPr>
-          <w:rFonts w:ascii="Tahoma" w:hAnsi="Tahoma" w:eastAsia="Tahoma" w:cs="Tahoma"/>
-          <w:color w:val="000000"/>
-          <w:rtl w:val="1"/>
-          <w:lang w:val="ar-SA" w:eastAsia="ar-SA" w:bidi="ar-SA"/>
-          <w:cs w:val="1"/>
-          <w:szCs w:val="22"/>
-        </w:rPr>
-        <w:t xml:space="preserve"> على حاسوب الطابعة. طباعة المتصفح لا تحتاج مفتاحا؛ يختار المستخدم الطابعة من حوار النظام.</w:t>
+          <w:rFonts w:ascii="Arial" w:hAnsi="Arial" w:eastAsia="Arial" w:cs="Arial"/>
+        </w:rPr>
+        <w:t>استخدم وكيل الطباعة المحلي المجاني على ‎Windows‎ أو ‎Linux‎ أو ‎macOS.‎ يتصل بالموقع عبر ‎HTTPS‎ ويعمل مع الاستضافة المشتركة و‎VPS‎ والخوادم المخصصة. أنشئ مستخدما بدور وكيل الطباعة وكلمة مرور للتطبيق. اربط معرفه وصفه هنا واضبط الصف نفسه في الوكيل المحلي. أبق الكمبيوتر مستيقظا. تستخدم الطباعة التلقائية الوكيل المحلي أو خادم ‎CUPS‎ الخاص بك. تستخدم طباعة المتصفح مربع حوار الطباعة.</w:t>
       </w:r>
     </w:p>
     <w:p>
@@ -6217,94 +5494,10 @@
       </w:pPr>
       <w:r>
         <w:rPr>
-          <w:rFonts w:ascii="Tahoma" w:hAnsi="Tahoma" w:eastAsia="Tahoma" w:cs="Tahoma"/>
-          <w:color w:val="000000"/>
+          <w:lang w:val="ar-SA" w:bidi="ar-SA"/>
           <w:rtl w:val="1"/>
-          <w:lang w:val="ar-SA" w:eastAsia="ar-SA" w:bidi="ar-SA"/>
-          <w:cs w:val="1"/>
-          <w:szCs w:val="22"/>
-        </w:rPr>
-        <w:t xml:space="preserve">يستخدم التشغيل </w:t>
-      </w:r>
-      <w:r>
-        <w:rPr>
-          <w:rFonts w:ascii="Courier New" w:hAnsi="Courier New" w:eastAsia="Courier New" w:cs="Courier New"/>
-          <w:color w:val="000000"/>
-          <w:rtl w:val="0"/>
-          <w:lang w:val="en-US" w:eastAsia="ar-SA" w:bidi="ar-SA"/>
-        </w:rPr>
-        <w:t>‎woocommerce_payment_complete‎</w:t>
-      </w:r>
-      <w:r>
-        <w:rPr>
-          <w:rFonts w:ascii="Tahoma" w:hAnsi="Tahoma" w:eastAsia="Tahoma" w:cs="Tahoma"/>
-          <w:color w:val="000000"/>
-          <w:rtl w:val="1"/>
-          <w:lang w:val="ar-SA" w:eastAsia="ar-SA" w:bidi="ar-SA"/>
-          <w:cs w:val="1"/>
-          <w:szCs w:val="22"/>
-        </w:rPr>
-        <w:t xml:space="preserve"> ومسار حالة مدفوعة بديل. يلزم تفعيل الإعداد و</w:t>
-      </w:r>
-      <w:r>
-        <w:rPr>
-          <w:rFonts w:ascii="Courier New" w:hAnsi="Courier New" w:eastAsia="Courier New" w:cs="Courier New"/>
-          <w:color w:val="000000"/>
-          <w:rtl w:val="0"/>
-          <w:lang w:val="en-US" w:eastAsia="ar-SA" w:bidi="ar-SA"/>
-        </w:rPr>
-        <w:t>‎is_paid()‎</w:t>
-      </w:r>
-      <w:r>
-        <w:rPr>
-          <w:rFonts w:ascii="Tahoma" w:hAnsi="Tahoma" w:eastAsia="Tahoma" w:cs="Tahoma"/>
-          <w:color w:val="000000"/>
-          <w:rtl w:val="1"/>
-          <w:lang w:val="ar-SA" w:eastAsia="ar-SA" w:bidi="ar-SA"/>
-          <w:cs w:val="1"/>
-          <w:szCs w:val="22"/>
-        </w:rPr>
-        <w:t xml:space="preserve"> وقالب ومفتاح وطابعة صالحون؛ قد يرفض </w:t>
-      </w:r>
-      <w:r>
-        <w:rPr>
-          <w:rFonts w:ascii="Courier New" w:hAnsi="Courier New" w:eastAsia="Courier New" w:cs="Courier New"/>
-          <w:color w:val="000000"/>
-          <w:rtl w:val="0"/>
-          <w:lang w:val="en-US" w:eastAsia="ar-SA" w:bidi="ar-SA"/>
-        </w:rPr>
-        <w:t>‎wcip_automatic_print_eligible‎</w:t>
-      </w:r>
-      <w:r>
-        <w:rPr>
-          <w:rFonts w:ascii="Tahoma" w:hAnsi="Tahoma" w:eastAsia="Tahoma" w:cs="Tahoma"/>
-          <w:color w:val="000000"/>
-          <w:rtl w:val="1"/>
-          <w:lang w:val="ar-SA" w:eastAsia="ar-SA" w:bidi="ar-SA"/>
-          <w:cs w:val="1"/>
-          <w:szCs w:val="22"/>
-        </w:rPr>
-        <w:t xml:space="preserve"> المهمة. قد تضع بوابة غير متصلة حالة </w:t>
-      </w:r>
-      <w:r>
-        <w:rPr>
-          <w:rFonts w:ascii="Tahoma" w:hAnsi="Tahoma" w:eastAsia="Tahoma" w:cs="Tahoma"/>
-          <w:color w:val="000000"/>
-          <w:rtl w:val="0"/>
-          <w:lang w:val="en-US" w:eastAsia="ar-SA" w:bidi="ar-SA"/>
-        </w:rPr>
-        <w:t>‎processing‎</w:t>
-      </w:r>
-      <w:r>
-        <w:rPr>
-          <w:rFonts w:ascii="Tahoma" w:hAnsi="Tahoma" w:eastAsia="Tahoma" w:cs="Tahoma"/>
-          <w:color w:val="000000"/>
-          <w:rtl w:val="1"/>
-          <w:lang w:val="ar-SA" w:eastAsia="ar-SA" w:bidi="ar-SA"/>
-          <w:cs w:val="1"/>
-          <w:szCs w:val="22"/>
-        </w:rPr>
-        <w:t xml:space="preserve"> قبل التحصيل. عطّل المرشح أدناه للاعتماد على حدث الدفع وتحقق من البوابة. لا تُطبع الطلبات القديمة تلقائيا ولا يلغي التعطيل المهام القائمة.</w:t>
+        </w:rPr>
+        <w:t>تتطلب السياسة الافتراضية حالة مدفوعة وتاريخ دفع مسجلا. تحتاج طرق الدفع عند الاستلام والتحويل والشيك إلى محول يؤكد التحصيل، وكذلك الدفع الجزئي. يفحص العامل السياسة قبل العرض والإرسال. تاريخ الإنشاء غير حاسم. تراعي الأحداث والاكتشاف المحدود وقت التفعيل أو الترقية؛ الطلبات القديمة تتطلب معاينة واختيارا صريحا.</w:t>
       </w:r>
     </w:p>
     <w:p>
@@ -6337,123 +5530,12 @@
       </w:pPr>
       <w:r>
         <w:rPr>
-          <w:rFonts w:ascii="Tahoma" w:hAnsi="Tahoma" w:eastAsia="Tahoma" w:cs="Tahoma"/>
+          <w:lang w:val="ar-SA" w:bidi="ar-SA" w:eastAsia="ar-SA"/>
           <w:color w:val="000000"/>
           <w:rtl w:val="1"/>
-          <w:lang w:val="ar-SA" w:eastAsia="ar-SA" w:bidi="ar-SA"/>
-          <w:cs w:val="1"/>
-          <w:szCs w:val="22"/>
-        </w:rPr>
-        <w:t xml:space="preserve">تضمن المفاتيح الفريدة وإعادة استخدام السجل مهمة تلقائية واحدة لكل طلب. اليدوي قابل للتكرار. يحجز العامل المهمة ذريّا ويعيد فحص الدفع قبل الإرسال. تستخدم الإجراءات </w:t>
-      </w:r>
-      <w:r>
-        <w:rPr>
-          <w:rFonts w:ascii="Courier New" w:hAnsi="Courier New" w:eastAsia="Courier New" w:cs="Courier New"/>
-          <w:color w:val="000000"/>
-          <w:rtl w:val="0"/>
-          <w:lang w:val="en-US" w:eastAsia="ar-SA" w:bidi="ar-SA"/>
-        </w:rPr>
-        <w:t>‎wcip_process_print_job‎</w:t>
-      </w:r>
-      <w:r>
-        <w:rPr>
-          <w:rFonts w:ascii="Tahoma" w:hAnsi="Tahoma" w:eastAsia="Tahoma" w:cs="Tahoma"/>
-          <w:color w:val="000000"/>
-          <w:rtl w:val="1"/>
-          <w:lang w:val="ar-SA" w:eastAsia="ar-SA" w:bidi="ar-SA"/>
-          <w:cs w:val="1"/>
-          <w:szCs w:val="22"/>
-        </w:rPr>
-        <w:t xml:space="preserve"> ومجموعة </w:t>
-      </w:r>
-      <w:r>
-        <w:rPr>
-          <w:rFonts w:ascii="Tahoma" w:hAnsi="Tahoma" w:eastAsia="Tahoma" w:cs="Tahoma"/>
-          <w:color w:val="000000"/>
-          <w:rtl w:val="0"/>
-          <w:lang w:val="en-US" w:eastAsia="ar-SA" w:bidi="ar-SA"/>
-        </w:rPr>
-        <w:t>‎wc-invoice-printer‎</w:t>
-      </w:r>
-      <w:r>
-        <w:rPr>
-          <w:rFonts w:ascii="Tahoma" w:hAnsi="Tahoma" w:eastAsia="Tahoma" w:cs="Tahoma"/>
-          <w:color w:val="000000"/>
-          <w:rtl w:val="1"/>
-          <w:lang w:val="ar-SA" w:eastAsia="ar-SA" w:bidi="ar-SA"/>
-          <w:cs w:val="1"/>
-          <w:szCs w:val="22"/>
-        </w:rPr>
-        <w:t xml:space="preserve"> و</w:t>
-      </w:r>
-      <w:r>
-        <w:rPr>
-          <w:rFonts w:ascii="Courier New" w:hAnsi="Courier New" w:eastAsia="Courier New" w:cs="Courier New"/>
-          <w:color w:val="000000"/>
-          <w:rtl w:val="0"/>
-          <w:lang w:val="en-US" w:eastAsia="ar-SA" w:bidi="ar-SA"/>
-        </w:rPr>
-        <w:t>‎job_id.‎</w:t>
-      </w:r>
-      <w:r>
-        <w:rPr>
-          <w:rFonts w:ascii="Tahoma" w:hAnsi="Tahoma" w:eastAsia="Tahoma" w:cs="Tahoma"/>
-          <w:color w:val="000000"/>
-          <w:rtl w:val="1"/>
-          <w:lang w:val="ar-SA" w:eastAsia="ar-SA" w:bidi="ar-SA"/>
-          <w:cs w:val="1"/>
-          <w:szCs w:val="22"/>
-        </w:rPr>
-        <w:t xml:space="preserve"> تفحص الاستعادة حتى ١٠٠ مهمة بمؤشر محفوظ؛ تعيد جدولة </w:t>
-      </w:r>
-      <w:r>
-        <w:rPr>
-          <w:rFonts w:ascii="Tahoma" w:hAnsi="Tahoma" w:eastAsia="Tahoma" w:cs="Tahoma"/>
-          <w:color w:val="000000"/>
-          <w:rtl w:val="0"/>
-          <w:lang w:val="en-US" w:eastAsia="ar-SA" w:bidi="ar-SA"/>
-        </w:rPr>
-        <w:t>‎queued‎</w:t>
-      </w:r>
-      <w:r>
-        <w:rPr>
-          <w:rFonts w:ascii="Tahoma" w:hAnsi="Tahoma" w:eastAsia="Tahoma" w:cs="Tahoma"/>
-          <w:color w:val="000000"/>
-          <w:rtl w:val="1"/>
-          <w:lang w:val="ar-SA" w:eastAsia="ar-SA" w:bidi="ar-SA"/>
-          <w:cs w:val="1"/>
-          <w:szCs w:val="22"/>
-        </w:rPr>
-        <w:t xml:space="preserve"> بلا إجراء، وتجعل </w:t>
-      </w:r>
-      <w:r>
-        <w:rPr>
-          <w:rFonts w:ascii="Tahoma" w:hAnsi="Tahoma" w:eastAsia="Tahoma" w:cs="Tahoma"/>
-          <w:color w:val="000000"/>
-          <w:rtl w:val="0"/>
-          <w:lang w:val="en-US" w:eastAsia="ar-SA" w:bidi="ar-SA"/>
-        </w:rPr>
-        <w:t>‎processing‎</w:t>
-      </w:r>
-      <w:r>
-        <w:rPr>
-          <w:rFonts w:ascii="Tahoma" w:hAnsi="Tahoma" w:eastAsia="Tahoma" w:cs="Tahoma"/>
-          <w:color w:val="000000"/>
-          <w:rtl w:val="1"/>
-          <w:lang w:val="ar-SA" w:eastAsia="ar-SA" w:bidi="ar-SA"/>
-          <w:cs w:val="1"/>
-          <w:szCs w:val="22"/>
-        </w:rPr>
-        <w:t xml:space="preserve"> الأقدم من عشر دقائق بلا إجراء نشط </w:t>
-      </w:r>
-      <w:r>
-        <w:rPr>
-          <w:rFonts w:ascii="Tahoma" w:hAnsi="Tahoma" w:eastAsia="Tahoma" w:cs="Tahoma"/>
-          <w:color w:val="000000"/>
-          <w:rtl w:val="0"/>
-          <w:lang w:val="en-US" w:eastAsia="ar-SA" w:bidi="ar-SA"/>
-        </w:rPr>
-        <w:t>‎unknown.‎</w:t>
+          <w:rFonts w:ascii="Arial" w:hAnsi="Arial" w:eastAsia="Arial" w:cs="Arial"/>
+        </w:rPr>
+        <w:t>‎CUPS:‎ تضمن المفاتيح الفريدة وإعادة استخدام السجل مهمة تلقائية واحدة لكل طلب. اليدوي قابل للتكرار. يحجز العامل المهمة ذريّا ويعيد فحص الدفع قبل الإرسال. تستخدم الإجراءات ‎‎wcip_process_print_job‎‎ ومجموعة ‎‎wc-invoice-printer‎‎ و‎‎job_id.‎‎ تفحص الاستعادة حتى ١٠٠ مهمة بمؤشر محفوظ؛ تعيد جدولة ‎‎queued‎‎ بلا إجراء، وتجعل ‎‎processing‎‎ الأقدم من عشر دقائق بلا إجراء نشط ‎‎unknown.‎‎</w:t>
       </w:r>
     </w:p>
     <w:tbl>
@@ -6491,7 +5573,7 @@
               <w:left w:w="100" w:type="dxa"/>
               <w:right w:w="100" w:type="dxa"/>
             </w:tcMar>
-            <w:shd w:fill="E7EDF2"/>
+            <w:shd w:fill="D9D9D9" w:val="clear"/>
           </w:tcPr>
           <w:p>
             <w:pPr>
@@ -6525,7 +5607,7 @@
               <w:left w:w="100" w:type="dxa"/>
               <w:right w:w="100" w:type="dxa"/>
             </w:tcMar>
-            <w:shd w:fill="E7EDF2"/>
+            <w:shd w:fill="D9D9D9" w:val="clear"/>
           </w:tcPr>
           <w:p>
             <w:pPr>
@@ -7141,94 +6223,12 @@
       </w:pPr>
       <w:r>
         <w:rPr>
-          <w:rFonts w:ascii="Tahoma" w:hAnsi="Tahoma" w:eastAsia="Tahoma" w:cs="Tahoma"/>
+          <w:lang w:val="ar-SA" w:bidi="ar-SA" w:eastAsia="ar-SA"/>
           <w:color w:val="000000"/>
           <w:rtl w:val="1"/>
-          <w:lang w:val="ar-SA" w:eastAsia="ar-SA" w:bidi="ar-SA"/>
-          <w:cs w:val="1"/>
-          <w:szCs w:val="22"/>
-        </w:rPr>
-        <w:t xml:space="preserve">تحدد لغة الموقع فواتير </w:t>
-      </w:r>
-      <w:r>
-        <w:rPr>
-          <w:rFonts w:ascii="Tahoma" w:hAnsi="Tahoma" w:eastAsia="Tahoma" w:cs="Tahoma"/>
-          <w:color w:val="000000"/>
-          <w:rtl w:val="0"/>
-          <w:lang w:val="en-US" w:eastAsia="ar-SA" w:bidi="ar-SA"/>
-        </w:rPr>
-        <w:t>‎PrintNode‎</w:t>
-      </w:r>
-      <w:r>
-        <w:rPr>
-          <w:rFonts w:ascii="Tahoma" w:hAnsi="Tahoma" w:eastAsia="Tahoma" w:cs="Tahoma"/>
-          <w:color w:val="000000"/>
-          <w:rtl w:val="1"/>
-          <w:lang w:val="ar-SA" w:eastAsia="ar-SA" w:bidi="ar-SA"/>
-          <w:cs w:val="1"/>
-          <w:szCs w:val="22"/>
-        </w:rPr>
-        <w:t xml:space="preserve"> الخلفية حتى المهام اليدوية. لغة ملف المسؤول للواجهة و</w:t>
-      </w:r>
-      <w:r>
-        <w:rPr>
-          <w:rFonts w:ascii="Tahoma" w:hAnsi="Tahoma" w:eastAsia="Tahoma" w:cs="Tahoma"/>
-          <w:color w:val="000000"/>
-          <w:rtl w:val="0"/>
-          <w:lang w:val="en-US" w:eastAsia="ar-SA" w:bidi="ar-SA"/>
-        </w:rPr>
-        <w:t>‎REST‎</w:t>
-      </w:r>
-      <w:r>
-        <w:rPr>
-          <w:rFonts w:ascii="Tahoma" w:hAnsi="Tahoma" w:eastAsia="Tahoma" w:cs="Tahoma"/>
-          <w:color w:val="000000"/>
-          <w:rtl w:val="1"/>
-          <w:lang w:val="ar-SA" w:eastAsia="ar-SA" w:bidi="ar-SA"/>
-          <w:cs w:val="1"/>
-          <w:szCs w:val="22"/>
-        </w:rPr>
-        <w:t xml:space="preserve"> والمعاينة. الفارسية والعربية </w:t>
-      </w:r>
-      <w:r>
-        <w:rPr>
-          <w:rFonts w:ascii="Tahoma" w:hAnsi="Tahoma" w:eastAsia="Tahoma" w:cs="Tahoma"/>
-          <w:color w:val="000000"/>
-          <w:rtl w:val="0"/>
-          <w:lang w:val="en-US" w:eastAsia="ar-SA" w:bidi="ar-SA"/>
-        </w:rPr>
-        <w:t>‎RTL‎</w:t>
-      </w:r>
-      <w:r>
-        <w:rPr>
-          <w:rFonts w:ascii="Tahoma" w:hAnsi="Tahoma" w:eastAsia="Tahoma" w:cs="Tahoma"/>
-          <w:color w:val="000000"/>
-          <w:rtl w:val="1"/>
-          <w:lang w:val="ar-SA" w:eastAsia="ar-SA" w:bidi="ar-SA"/>
-          <w:cs w:val="1"/>
-          <w:szCs w:val="22"/>
-        </w:rPr>
-        <w:t xml:space="preserve">؛ معاينة </w:t>
-      </w:r>
-      <w:r>
-        <w:rPr>
-          <w:rFonts w:ascii="Tahoma" w:hAnsi="Tahoma" w:eastAsia="Tahoma" w:cs="Tahoma"/>
-          <w:color w:val="000000"/>
-          <w:rtl w:val="0"/>
-          <w:lang w:val="en-US" w:eastAsia="ar-SA" w:bidi="ar-SA"/>
-        </w:rPr>
-        <w:t>‎RTL‎</w:t>
-      </w:r>
-      <w:r>
-        <w:rPr>
-          <w:rFonts w:ascii="Tahoma" w:hAnsi="Tahoma" w:eastAsia="Tahoma" w:cs="Tahoma"/>
-          <w:color w:val="000000"/>
-          <w:rtl w:val="1"/>
-          <w:lang w:val="ar-SA" w:eastAsia="ar-SA" w:bidi="ar-SA"/>
-          <w:cs w:val="1"/>
-          <w:szCs w:val="22"/>
-        </w:rPr>
-        <w:t xml:space="preserve"> تغير الاتجاه فقط. تترجم الكتالوجات التسميات والعينات، وليس نصوص المنتجات والعملاء والنشاط والملاحظات المحفوظة.</w:t>
+          <w:rFonts w:ascii="Arial" w:hAnsi="Arial" w:eastAsia="Arial" w:cs="Arial"/>
+        </w:rPr>
+        <w:t>تحدد لغة الموقع فواتير ‎‎CUPS‎ / ‎agent‎‎ الخلفية حتى المهام اليدوية. لغة ملف المسؤول للواجهة و‎‎REST‎‎ والمعاينة. الفارسية والعربية ‎‎RTL‎‎؛ معاينة ‎‎RTL‎‎ تغير الاتجاه فقط. تترجم الكتالوجات التسميات والعينات، وليس نصوص المنتجات والعملاء والنشاط والملاحظات المحفوظة.</w:t>
       </w:r>
     </w:p>
     <w:tbl>
@@ -7267,7 +6267,7 @@
               <w:left w:w="100" w:type="dxa"/>
               <w:right w:w="100" w:type="dxa"/>
             </w:tcMar>
-            <w:shd w:fill="E7EDF2"/>
+            <w:shd w:fill="D9D9D9" w:val="clear"/>
           </w:tcPr>
           <w:p>
             <w:pPr>
@@ -7301,7 +6301,7 @@
               <w:left w:w="100" w:type="dxa"/>
               <w:right w:w="100" w:type="dxa"/>
             </w:tcMar>
-            <w:shd w:fill="E7EDF2"/>
+            <w:shd w:fill="D9D9D9" w:val="clear"/>
           </w:tcPr>
           <w:p>
             <w:pPr>
@@ -7335,7 +6335,7 @@
               <w:left w:w="100" w:type="dxa"/>
               <w:right w:w="100" w:type="dxa"/>
             </w:tcMar>
-            <w:shd w:fill="E7EDF2"/>
+            <w:shd w:fill="D9D9D9" w:val="clear"/>
           </w:tcPr>
           <w:p>
             <w:pPr>
@@ -9333,7 +8333,7 @@
           <w:rtl w:val="0"/>
           <w:lang w:val="en-US" w:eastAsia="ar-SA" w:bidi="ar-SA"/>
         </w:rPr>
-        <w:t>‎PrintNode.‎</w:t>
+        <w:t>‎CUPS.‎</w:t>
       </w:r>
       <w:r>
         <w:rPr>
@@ -9813,134 +8813,10 @@
       </w:pPr>
       <w:r>
         <w:rPr>
-          <w:rFonts w:ascii="Tahoma" w:hAnsi="Tahoma" w:eastAsia="Tahoma" w:cs="Tahoma"/>
-          <w:color w:val="000000"/>
+          <w:lang w:val="ar-SA" w:bidi="ar-SA"/>
           <w:rtl w:val="1"/>
-          <w:lang w:val="ar-SA" w:eastAsia="ar-SA" w:bidi="ar-SA"/>
-          <w:cs w:val="1"/>
-          <w:szCs w:val="22"/>
-        </w:rPr>
-        <w:t xml:space="preserve">أبق المفتاح في الخادم. يتقدم </w:t>
-      </w:r>
-      <w:r>
-        <w:rPr>
-          <w:rFonts w:ascii="Courier New" w:hAnsi="Courier New" w:eastAsia="Courier New" w:cs="Courier New"/>
-          <w:color w:val="000000"/>
-          <w:rtl w:val="0"/>
-          <w:lang w:val="en-US" w:eastAsia="ar-SA" w:bidi="ar-SA"/>
-        </w:rPr>
-        <w:t>‎WCIP_PRINTNODE_API_KEY‎</w:t>
-      </w:r>
-      <w:r>
-        <w:rPr>
-          <w:rFonts w:ascii="Tahoma" w:hAnsi="Tahoma" w:eastAsia="Tahoma" w:cs="Tahoma"/>
-          <w:color w:val="000000"/>
-          <w:rtl w:val="1"/>
-          <w:lang w:val="ar-SA" w:eastAsia="ar-SA" w:bidi="ar-SA"/>
-          <w:cs w:val="1"/>
-          <w:szCs w:val="22"/>
-        </w:rPr>
-        <w:t xml:space="preserve"> غير الفارغ في </w:t>
-      </w:r>
-      <w:r>
-        <w:rPr>
-          <w:rFonts w:ascii="Tahoma" w:hAnsi="Tahoma" w:eastAsia="Tahoma" w:cs="Tahoma"/>
-          <w:color w:val="000000"/>
-          <w:rtl w:val="0"/>
-          <w:lang w:val="en-US" w:eastAsia="ar-SA" w:bidi="ar-SA"/>
-        </w:rPr>
-        <w:t>‎wp-config.php‎</w:t>
-      </w:r>
-      <w:r>
-        <w:rPr>
-          <w:rFonts w:ascii="Tahoma" w:hAnsi="Tahoma" w:eastAsia="Tahoma" w:cs="Tahoma"/>
-          <w:color w:val="000000"/>
-          <w:rtl w:val="1"/>
-          <w:lang w:val="ar-SA" w:eastAsia="ar-SA" w:bidi="ar-SA"/>
-          <w:cs w:val="1"/>
-          <w:szCs w:val="22"/>
-        </w:rPr>
-        <w:t xml:space="preserve"> على القيمة المحفوظة. المفتاح المحفوظ غير مشفر وقد يظهر في النسخ الاحتياطية؛ </w:t>
-      </w:r>
-      <w:r>
-        <w:rPr>
-          <w:rFonts w:ascii="Tahoma" w:hAnsi="Tahoma" w:eastAsia="Tahoma" w:cs="Tahoma"/>
-          <w:color w:val="000000"/>
-          <w:rtl w:val="0"/>
-          <w:lang w:val="en-US" w:eastAsia="ar-SA" w:bidi="ar-SA"/>
-        </w:rPr>
-        <w:t>‎REST‎</w:t>
-      </w:r>
-      <w:r>
-        <w:rPr>
-          <w:rFonts w:ascii="Tahoma" w:hAnsi="Tahoma" w:eastAsia="Tahoma" w:cs="Tahoma"/>
-          <w:color w:val="000000"/>
-          <w:rtl w:val="1"/>
-          <w:lang w:val="ar-SA" w:eastAsia="ar-SA" w:bidi="ar-SA"/>
-          <w:cs w:val="1"/>
-          <w:szCs w:val="22"/>
-        </w:rPr>
-        <w:t xml:space="preserve"> لا يعيده. يتلقى </w:t>
-      </w:r>
-      <w:r>
-        <w:rPr>
-          <w:rFonts w:ascii="Tahoma" w:hAnsi="Tahoma" w:eastAsia="Tahoma" w:cs="Tahoma"/>
-          <w:color w:val="000000"/>
-          <w:rtl w:val="0"/>
-          <w:lang w:val="en-US" w:eastAsia="ar-SA" w:bidi="ar-SA"/>
-        </w:rPr>
-        <w:t>‎PrintNode‎</w:t>
-      </w:r>
-      <w:r>
-        <w:rPr>
-          <w:rFonts w:ascii="Tahoma" w:hAnsi="Tahoma" w:eastAsia="Tahoma" w:cs="Tahoma"/>
-          <w:color w:val="000000"/>
-          <w:rtl w:val="1"/>
-          <w:lang w:val="ar-SA" w:eastAsia="ar-SA" w:bidi="ar-SA"/>
-          <w:cs w:val="1"/>
-          <w:szCs w:val="22"/>
-        </w:rPr>
-        <w:t xml:space="preserve"> بيانات </w:t>
-      </w:r>
-      <w:r>
-        <w:rPr>
-          <w:rFonts w:ascii="Tahoma" w:hAnsi="Tahoma" w:eastAsia="Tahoma" w:cs="Tahoma"/>
-          <w:color w:val="000000"/>
-          <w:rtl w:val="0"/>
-          <w:lang w:val="en-US" w:eastAsia="ar-SA" w:bidi="ar-SA"/>
-        </w:rPr>
-        <w:t>‎PDF.‎</w:t>
-      </w:r>
-      <w:r>
-        <w:rPr>
-          <w:rFonts w:ascii="Tahoma" w:hAnsi="Tahoma" w:eastAsia="Tahoma" w:cs="Tahoma"/>
-          <w:color w:val="000000"/>
-          <w:rtl w:val="1"/>
-          <w:lang w:val="ar-SA" w:eastAsia="ar-SA" w:bidi="ar-SA"/>
-          <w:cs w:val="1"/>
-          <w:szCs w:val="22"/>
-        </w:rPr>
-        <w:t xml:space="preserve"> ملفات </w:t>
-      </w:r>
-      <w:r>
-        <w:rPr>
-          <w:rFonts w:ascii="Tahoma" w:hAnsi="Tahoma" w:eastAsia="Tahoma" w:cs="Tahoma"/>
-          <w:color w:val="000000"/>
-          <w:rtl w:val="0"/>
-          <w:lang w:val="en-US" w:eastAsia="ar-SA" w:bidi="ar-SA"/>
-        </w:rPr>
-        <w:t>‎PDF‎</w:t>
-      </w:r>
-      <w:r>
-        <w:rPr>
-          <w:rFonts w:ascii="Tahoma" w:hAnsi="Tahoma" w:eastAsia="Tahoma" w:cs="Tahoma"/>
-          <w:color w:val="000000"/>
-          <w:rtl w:val="1"/>
-          <w:lang w:val="ar-SA" w:eastAsia="ar-SA" w:bidi="ar-SA"/>
-          <w:cs w:val="1"/>
-          <w:szCs w:val="22"/>
-        </w:rPr>
-        <w:t xml:space="preserve"> المؤقتة خاصة وتُنظف بعد التنفيذ؛ تجنب السجلات الحساسة.</w:t>
+        </w:rPr>
+        <w:t>عند تعيين نص غير فارغ في ‎WCIP_CUPS_PASSWORD‎، يُقفل حقل كلمة المرور في الإعدادات. لا تعرض كلمة المرور المحفوظة ولا ترجع إلى المتصفح. تحتوي ملفات ‎PDF‎ على بيانات العملاء وترسل فقط إلى خادم ‎CUPS‎ المحدد عند استخدام هذه الوجهة.</w:t>
       </w:r>
     </w:p>
     <w:p>
@@ -9952,172 +8828,34 @@
         <w:rPr>
           <w:rFonts w:ascii="Tahoma" w:hAnsi="Tahoma" w:eastAsia="Tahoma" w:cs="Tahoma"/>
           <w:color w:val="000000"/>
-          <w:rtl w:val="1"/>
+          <w:rtl/>
           <w:lang w:val="ar-SA" w:eastAsia="ar-SA" w:bidi="ar-SA"/>
           <w:cs w:val="1"/>
           <w:szCs w:val="22"/>
         </w:rPr>
-        <w:t>تحفظ {</w:t>
-      </w:r>
-      <w:r>
-        <w:rPr>
-          <w:rFonts w:ascii="Courier New" w:hAnsi="Courier New" w:eastAsia="Courier New" w:cs="Courier New"/>
+        <w:t xml:space="preserve">تحفظ </w:t>
+      </w:r>
+      <w:r>
+        <w:rPr>
+          <w:rFonts w:ascii="Courier New" w:hAnsi="Courier New" w:eastAsia="Tahoma" w:cs="Tahoma"/>
           <w:color w:val="000000"/>
           <w:rtl w:val="0"/>
-          <w:lang w:val="en-US" w:eastAsia="ar-SA" w:bidi="ar-SA"/>
-        </w:rPr>
-        <w:t>‎$wpdb-&gt;prefix}wc_invoice_print_jobs‎</w:t>
+          <w:lang w:val="en-US" w:eastAsia="ar-SA" w:bidi="en-US"/>
+          <w:cs w:val="1"/>
+          <w:szCs w:val="22"/>
+        </w:rPr>
+        <w:t>‎wc_invoice_print_jobs‎</w:t>
       </w:r>
       <w:r>
         <w:rPr>
           <w:rFonts w:ascii="Tahoma" w:hAnsi="Tahoma" w:eastAsia="Tahoma" w:cs="Tahoma"/>
           <w:color w:val="000000"/>
-          <w:rtl w:val="1"/>
+          <w:rtl/>
           <w:lang w:val="ar-SA" w:eastAsia="ar-SA" w:bidi="ar-SA"/>
           <w:cs w:val="1"/>
           <w:szCs w:val="22"/>
         </w:rPr>
-        <w:t xml:space="preserve"> المراجع والحالات والتأكيد دون </w:t>
-      </w:r>
-      <w:r>
-        <w:rPr>
-          <w:rFonts w:ascii="Tahoma" w:hAnsi="Tahoma" w:eastAsia="Tahoma" w:cs="Tahoma"/>
-          <w:color w:val="000000"/>
-          <w:rtl w:val="0"/>
-          <w:lang w:val="en-US" w:eastAsia="ar-SA" w:bidi="ar-SA"/>
-        </w:rPr>
-        <w:t>‎PDF.‎</w:t>
-      </w:r>
-      <w:r>
-        <w:rPr>
-          <w:rFonts w:ascii="Tahoma" w:hAnsi="Tahoma" w:eastAsia="Tahoma" w:cs="Tahoma"/>
-          <w:color w:val="000000"/>
-          <w:rtl w:val="1"/>
-          <w:lang w:val="ar-SA" w:eastAsia="ar-SA" w:bidi="ar-SA"/>
-          <w:cs w:val="1"/>
-          <w:szCs w:val="22"/>
-        </w:rPr>
-        <w:t xml:space="preserve"> تشمل الخيارات </w:t>
-      </w:r>
-      <w:r>
-        <w:rPr>
-          <w:rFonts w:ascii="Courier New" w:hAnsi="Courier New" w:eastAsia="Courier New" w:cs="Courier New"/>
-          <w:color w:val="000000"/>
-          <w:rtl w:val="0"/>
-          <w:lang w:val="en-US" w:eastAsia="ar-SA" w:bidi="ar-SA"/>
-        </w:rPr>
-        <w:t>‎wcip_settings‎</w:t>
-      </w:r>
-      <w:r>
-        <w:rPr>
-          <w:rFonts w:ascii="Tahoma" w:hAnsi="Tahoma" w:eastAsia="Tahoma" w:cs="Tahoma"/>
-          <w:color w:val="000000"/>
-          <w:rtl w:val="1"/>
-          <w:lang w:val="ar-SA" w:eastAsia="ar-SA" w:bidi="ar-SA"/>
-          <w:cs w:val="1"/>
-          <w:szCs w:val="22"/>
-        </w:rPr>
-        <w:t xml:space="preserve"> و</w:t>
-      </w:r>
-      <w:r>
-        <w:rPr>
-          <w:rFonts w:ascii="Courier New" w:hAnsi="Courier New" w:eastAsia="Courier New" w:cs="Courier New"/>
-          <w:color w:val="000000"/>
-          <w:rtl w:val="0"/>
-          <w:lang w:val="en-US" w:eastAsia="ar-SA" w:bidi="ar-SA"/>
-        </w:rPr>
-        <w:t>‎wcip_db_version‎</w:t>
-      </w:r>
-      <w:r>
-        <w:rPr>
-          <w:rFonts w:ascii="Tahoma" w:hAnsi="Tahoma" w:eastAsia="Tahoma" w:cs="Tahoma"/>
-          <w:color w:val="000000"/>
-          <w:rtl w:val="1"/>
-          <w:lang w:val="ar-SA" w:eastAsia="ar-SA" w:bidi="ar-SA"/>
-          <w:cs w:val="1"/>
-          <w:szCs w:val="22"/>
-        </w:rPr>
-        <w:t xml:space="preserve"> و</w:t>
-      </w:r>
-      <w:r>
-        <w:rPr>
-          <w:rFonts w:ascii="Courier New" w:hAnsi="Courier New" w:eastAsia="Courier New" w:cs="Courier New"/>
-          <w:color w:val="000000"/>
-          <w:rtl w:val="0"/>
-          <w:lang w:val="en-US" w:eastAsia="ar-SA" w:bidi="ar-SA"/>
-        </w:rPr>
-        <w:t>‎wcip_capabilities_version‎</w:t>
-      </w:r>
-      <w:r>
-        <w:rPr>
-          <w:rFonts w:ascii="Tahoma" w:hAnsi="Tahoma" w:eastAsia="Tahoma" w:cs="Tahoma"/>
-          <w:color w:val="000000"/>
-          <w:rtl w:val="1"/>
-          <w:lang w:val="ar-SA" w:eastAsia="ar-SA" w:bidi="ar-SA"/>
-          <w:cs w:val="1"/>
-          <w:szCs w:val="22"/>
-        </w:rPr>
-        <w:t xml:space="preserve"> و</w:t>
-      </w:r>
-      <w:r>
-        <w:rPr>
-          <w:rFonts w:ascii="Courier New" w:hAnsi="Courier New" w:eastAsia="Courier New" w:cs="Courier New"/>
-          <w:color w:val="000000"/>
-          <w:rtl w:val="0"/>
-          <w:lang w:val="en-US" w:eastAsia="ar-SA" w:bidi="ar-SA"/>
-        </w:rPr>
-        <w:t>‎wcip_recovery_cursor.‎</w:t>
-      </w:r>
-      <w:r>
-        <w:rPr>
-          <w:rFonts w:ascii="Tahoma" w:hAnsi="Tahoma" w:eastAsia="Tahoma" w:cs="Tahoma"/>
-          <w:color w:val="000000"/>
-          <w:rtl w:val="1"/>
-          <w:lang w:val="ar-SA" w:eastAsia="ar-SA" w:bidi="ar-SA"/>
-          <w:cs w:val="1"/>
-          <w:szCs w:val="22"/>
-        </w:rPr>
-        <w:t xml:space="preserve"> التفعيل يرحّل البنية؛ التعطيل يلغي الإجراءات ويحفظ البيانات والاستعادة تعيد الصف. الحذف يحفظ البيانات إلا مع </w:t>
-      </w:r>
-      <w:r>
-        <w:rPr>
-          <w:rFonts w:ascii="Courier New" w:hAnsi="Courier New" w:eastAsia="Courier New" w:cs="Courier New"/>
-          <w:color w:val="000000"/>
-          <w:rtl w:val="0"/>
-          <w:lang w:val="en-US" w:eastAsia="ar-SA" w:bidi="ar-SA"/>
-        </w:rPr>
-        <w:t>‎wcip_delete_data_on_uninstall.‎</w:t>
-      </w:r>
-      <w:r>
-        <w:rPr>
-          <w:rFonts w:ascii="Tahoma" w:hAnsi="Tahoma" w:eastAsia="Tahoma" w:cs="Tahoma"/>
-          <w:color w:val="000000"/>
-          <w:rtl w:val="1"/>
-          <w:lang w:val="ar-SA" w:eastAsia="ar-SA" w:bidi="ar-SA"/>
-          <w:cs w:val="1"/>
-          <w:szCs w:val="22"/>
-        </w:rPr>
-        <w:t xml:space="preserve"> لا حد احتفاظ تلقائي للسجل؛ اختبر </w:t>
-      </w:r>
-      <w:r>
-        <w:rPr>
-          <w:rFonts w:ascii="Tahoma" w:hAnsi="Tahoma" w:eastAsia="Tahoma" w:cs="Tahoma"/>
-          <w:color w:val="000000"/>
-          <w:rtl w:val="0"/>
-          <w:lang w:val="en-US" w:eastAsia="ar-SA" w:bidi="ar-SA"/>
-        </w:rPr>
-        <w:t>‎multisite‎</w:t>
-      </w:r>
-      <w:r>
-        <w:rPr>
-          <w:rFonts w:ascii="Tahoma" w:hAnsi="Tahoma" w:eastAsia="Tahoma" w:cs="Tahoma"/>
-          <w:color w:val="000000"/>
-          <w:rtl w:val="1"/>
-          <w:lang w:val="ar-SA" w:eastAsia="ar-SA" w:bidi="ar-SA"/>
-          <w:cs w:val="1"/>
-          <w:szCs w:val="22"/>
-        </w:rPr>
-        <w:t xml:space="preserve"> منفصلا.</w:t>
+        <w:t xml:space="preserve"> المراجع والحالات والتأكيد دون ‎PDF.‎ تشمل الخيارات ‎wcip_settings‎ و‎wcip_db_version‎ و‎wcip_capabilities_version‎ و‎wcip_recovery_cursor.‎ التفعيل يرحّل البنية؛ التعطيل يلغي الإجراءات ويحفظ البيانات والاستعادة تعيد الصف. الحذف يحفظ البيانات إلا مع ‎wcip_delete_data_on_uninstall.‎ لا حد احتفاظ تلقائي للسجل؛ اختبر ‎multisite‎ منفصلا.</w:t>
       </w:r>
     </w:p>
     <w:p>
@@ -10372,6 +9110,8 @@
           <w:rtl w:val="0"/>
           <w:lang w:val="en-US" w:eastAsia="ar-SA" w:bidi="ar-SA"/>
         </w:rPr>
+        <w:t># Database table: {$wpdb-&gt;prefix}wc_invoice_print_jobs</w:t>
+        <w:br/>
         <w:t>composer install --no-dev --prefer-dist --optimize-autoloader</w:t>
       </w:r>
     </w:p>
@@ -10405,194 +9145,12 @@
       </w:pPr>
       <w:r>
         <w:rPr>
-          <w:rFonts w:ascii="Tahoma" w:hAnsi="Tahoma" w:eastAsia="Tahoma" w:cs="Tahoma"/>
+          <w:lang w:val="ar-SA" w:bidi="ar-SA" w:eastAsia="ar-SA"/>
           <w:color w:val="000000"/>
           <w:rtl w:val="1"/>
-          <w:lang w:val="ar-SA" w:eastAsia="ar-SA" w:bidi="ar-SA"/>
-          <w:cs w:val="1"/>
-          <w:szCs w:val="22"/>
-        </w:rPr>
-        <w:t xml:space="preserve">للصف المتوقف افحص </w:t>
-      </w:r>
-      <w:r>
-        <w:rPr>
-          <w:rFonts w:ascii="Tahoma" w:hAnsi="Tahoma" w:eastAsia="Tahoma" w:cs="Tahoma"/>
-          <w:color w:val="000000"/>
-          <w:rtl w:val="0"/>
-          <w:lang w:val="en-US" w:eastAsia="ar-SA" w:bidi="ar-SA"/>
-        </w:rPr>
-        <w:t>‎Scheduled‎</w:t>
-      </w:r>
-      <w:r>
-        <w:rPr>
-          <w:rFonts w:ascii="Tahoma" w:hAnsi="Tahoma" w:eastAsia="Tahoma" w:cs="Tahoma"/>
-          <w:color w:val="000000"/>
-          <w:rtl w:val="1"/>
-          <w:lang w:val="ar-SA" w:eastAsia="ar-SA" w:bidi="ar-SA"/>
-          <w:cs w:val="1"/>
-          <w:szCs w:val="22"/>
-        </w:rPr>
-        <w:t xml:space="preserve"> </w:t>
-      </w:r>
-      <w:r>
-        <w:rPr>
-          <w:rFonts w:ascii="Tahoma" w:hAnsi="Tahoma" w:eastAsia="Tahoma" w:cs="Tahoma"/>
-          <w:color w:val="000000"/>
-          <w:rtl w:val="0"/>
-          <w:lang w:val="en-US" w:eastAsia="ar-SA" w:bidi="ar-SA"/>
-        </w:rPr>
-        <w:t>‎Actions‎</w:t>
-      </w:r>
-      <w:r>
-        <w:rPr>
-          <w:rFonts w:ascii="Tahoma" w:hAnsi="Tahoma" w:eastAsia="Tahoma" w:cs="Tahoma"/>
-          <w:color w:val="000000"/>
-          <w:rtl w:val="1"/>
-          <w:lang w:val="ar-SA" w:eastAsia="ar-SA" w:bidi="ar-SA"/>
-          <w:cs w:val="1"/>
-          <w:szCs w:val="22"/>
-        </w:rPr>
-        <w:t xml:space="preserve"> ومجموعة الإضافة و</w:t>
-      </w:r>
-      <w:r>
-        <w:rPr>
-          <w:rFonts w:ascii="Tahoma" w:hAnsi="Tahoma" w:eastAsia="Tahoma" w:cs="Tahoma"/>
-          <w:color w:val="000000"/>
-          <w:rtl w:val="0"/>
-          <w:lang w:val="en-US" w:eastAsia="ar-SA" w:bidi="ar-SA"/>
-        </w:rPr>
-        <w:t>‎WP‎</w:t>
-      </w:r>
-      <w:r>
-        <w:rPr>
-          <w:rFonts w:ascii="Tahoma" w:hAnsi="Tahoma" w:eastAsia="Tahoma" w:cs="Tahoma"/>
-          <w:color w:val="000000"/>
-          <w:rtl w:val="1"/>
-          <w:lang w:val="ar-SA" w:eastAsia="ar-SA" w:bidi="ar-SA"/>
-          <w:cs w:val="1"/>
-          <w:szCs w:val="22"/>
-        </w:rPr>
-        <w:t xml:space="preserve"> </w:t>
-      </w:r>
-      <w:r>
-        <w:rPr>
-          <w:rFonts w:ascii="Tahoma" w:hAnsi="Tahoma" w:eastAsia="Tahoma" w:cs="Tahoma"/>
-          <w:color w:val="000000"/>
-          <w:rtl w:val="0"/>
-          <w:lang w:val="en-US" w:eastAsia="ar-SA" w:bidi="ar-SA"/>
-        </w:rPr>
-        <w:t>‎Cron‎</w:t>
-      </w:r>
-      <w:r>
-        <w:rPr>
-          <w:rFonts w:ascii="Tahoma" w:hAnsi="Tahoma" w:eastAsia="Tahoma" w:cs="Tahoma"/>
-          <w:color w:val="000000"/>
-          <w:rtl w:val="1"/>
-          <w:lang w:val="ar-SA" w:eastAsia="ar-SA" w:bidi="ar-SA"/>
-          <w:cs w:val="1"/>
-          <w:szCs w:val="22"/>
-        </w:rPr>
-        <w:t xml:space="preserve"> و</w:t>
-      </w:r>
-      <w:r>
-        <w:rPr>
-          <w:rFonts w:ascii="Tahoma" w:hAnsi="Tahoma" w:eastAsia="Tahoma" w:cs="Tahoma"/>
-          <w:color w:val="000000"/>
-          <w:rtl w:val="0"/>
-          <w:lang w:val="en-US" w:eastAsia="ar-SA" w:bidi="ar-SA"/>
-        </w:rPr>
-        <w:t>‎loopback.‎</w:t>
-      </w:r>
-      <w:r>
-        <w:rPr>
-          <w:rFonts w:ascii="Tahoma" w:hAnsi="Tahoma" w:eastAsia="Tahoma" w:cs="Tahoma"/>
-          <w:color w:val="000000"/>
-          <w:rtl w:val="1"/>
-          <w:lang w:val="ar-SA" w:eastAsia="ar-SA" w:bidi="ar-SA"/>
-          <w:cs w:val="1"/>
-          <w:szCs w:val="22"/>
-        </w:rPr>
-        <w:t xml:space="preserve"> لفشل </w:t>
-      </w:r>
-      <w:r>
-        <w:rPr>
-          <w:rFonts w:ascii="Tahoma" w:hAnsi="Tahoma" w:eastAsia="Tahoma" w:cs="Tahoma"/>
-          <w:color w:val="000000"/>
-          <w:rtl w:val="0"/>
-          <w:lang w:val="en-US" w:eastAsia="ar-SA" w:bidi="ar-SA"/>
-        </w:rPr>
-        <w:t>‎PDF‎</w:t>
-      </w:r>
-      <w:r>
-        <w:rPr>
-          <w:rFonts w:ascii="Tahoma" w:hAnsi="Tahoma" w:eastAsia="Tahoma" w:cs="Tahoma"/>
-          <w:color w:val="000000"/>
-          <w:rtl w:val="1"/>
-          <w:lang w:val="ar-SA" w:eastAsia="ar-SA" w:bidi="ar-SA"/>
-          <w:cs w:val="1"/>
-          <w:szCs w:val="22"/>
-        </w:rPr>
-        <w:t xml:space="preserve"> افحص الاعتماديات والخطوط والامتدادات والذاكرة ومجلد المؤقت. الطابعة المحلية في حوار النظام؛ التحديث يكتشف </w:t>
-      </w:r>
-      <w:r>
-        <w:rPr>
-          <w:rFonts w:ascii="Tahoma" w:hAnsi="Tahoma" w:eastAsia="Tahoma" w:cs="Tahoma"/>
-          <w:color w:val="000000"/>
-          <w:rtl w:val="0"/>
-          <w:lang w:val="en-US" w:eastAsia="ar-SA" w:bidi="ar-SA"/>
-        </w:rPr>
-        <w:t>‎PrintNode‎</w:t>
-      </w:r>
-      <w:r>
-        <w:rPr>
-          <w:rFonts w:ascii="Tahoma" w:hAnsi="Tahoma" w:eastAsia="Tahoma" w:cs="Tahoma"/>
-          <w:color w:val="000000"/>
-          <w:rtl w:val="1"/>
-          <w:lang w:val="ar-SA" w:eastAsia="ar-SA" w:bidi="ar-SA"/>
-          <w:cs w:val="1"/>
-          <w:szCs w:val="22"/>
-        </w:rPr>
-        <w:t xml:space="preserve"> فقط. افحص سجل الخدمة والطابعة قبل إعادة </w:t>
-      </w:r>
-      <w:r>
-        <w:rPr>
-          <w:rFonts w:ascii="Tahoma" w:hAnsi="Tahoma" w:eastAsia="Tahoma" w:cs="Tahoma"/>
-          <w:color w:val="000000"/>
-          <w:rtl w:val="0"/>
-          <w:lang w:val="en-US" w:eastAsia="ar-SA" w:bidi="ar-SA"/>
-        </w:rPr>
-        <w:t>‎unknown‎</w:t>
-      </w:r>
-      <w:r>
-        <w:rPr>
-          <w:rFonts w:ascii="Tahoma" w:hAnsi="Tahoma" w:eastAsia="Tahoma" w:cs="Tahoma"/>
-          <w:color w:val="000000"/>
-          <w:rtl w:val="1"/>
-          <w:lang w:val="ar-SA" w:eastAsia="ar-SA" w:bidi="ar-SA"/>
-          <w:cs w:val="1"/>
-          <w:szCs w:val="22"/>
-        </w:rPr>
-        <w:t xml:space="preserve"> أو </w:t>
-      </w:r>
-      <w:r>
-        <w:rPr>
-          <w:rFonts w:ascii="Tahoma" w:hAnsi="Tahoma" w:eastAsia="Tahoma" w:cs="Tahoma"/>
-          <w:color w:val="000000"/>
-          <w:rtl w:val="0"/>
-          <w:lang w:val="en-US" w:eastAsia="ar-SA" w:bidi="ar-SA"/>
-        </w:rPr>
-        <w:t>‎submitted‎</w:t>
-      </w:r>
-      <w:r>
-        <w:rPr>
-          <w:rFonts w:ascii="Tahoma" w:hAnsi="Tahoma" w:eastAsia="Tahoma" w:cs="Tahoma"/>
-          <w:color w:val="000000"/>
-          <w:rtl w:val="1"/>
-          <w:lang w:val="ar-SA" w:eastAsia="ar-SA" w:bidi="ar-SA"/>
-          <w:cs w:val="1"/>
-          <w:szCs w:val="22"/>
-        </w:rPr>
-        <w:t xml:space="preserve"> بلا ورق.</w:t>
+          <w:rFonts w:ascii="Arial" w:hAnsi="Arial" w:eastAsia="Arial" w:cs="Arial"/>
+        </w:rPr>
+        <w:t>للمهام المنتظرة لدى الوكيل تحقق من آخر اتصال والحاسوب المستيقظ و‎HTTPS‎ وكلمة مرور التطبيق وتطابق الصف المنطقي. لدى ‎CUPS‎ افحص الإجراءات المجدولة و‎WP‎ ‎Cron‎ والاتصال. افحص الصف المحلي والسجل والورق قبل إعادة مهمة غير مؤكدة. أخطاء ‎PDF‎ تستلزم فحص امتدادات ‎PHP‎ والخطوط والذاكرة وأذونات الملفات المؤقتة.</w:t>
       </w:r>
     </w:p>
     <w:p>
@@ -10666,7 +9224,7 @@
               <w:left w:w="100" w:type="dxa"/>
               <w:right w:w="100" w:type="dxa"/>
             </w:tcMar>
-            <w:shd w:fill="E7EDF2"/>
+            <w:shd w:fill="D9D9D9" w:val="clear"/>
           </w:tcPr>
           <w:p>
             <w:pPr>
@@ -10700,7 +9258,7 @@
               <w:left w:w="100" w:type="dxa"/>
               <w:right w:w="100" w:type="dxa"/>
             </w:tcMar>
-            <w:shd w:fill="E7EDF2"/>
+            <w:shd w:fill="D9D9D9" w:val="clear"/>
           </w:tcPr>
           <w:p>
             <w:pPr>
@@ -11267,9 +9825,1259 @@
         <w:spacing w:after="40"/>
       </w:pPr>
     </w:p>
+    <w:p>
+      <w:pPr>
+        <w:pStyle w:val="Heading1"/>
+        <w:bidi w:val="1"/>
+        <w:jc w:val="start"/>
+      </w:pPr>
+      <w:r>
+        <w:rPr>
+          <w:lang w:val="ar-SA" w:bidi="ar-SA"/>
+          <w:rtl w:val="1"/>
+        </w:rPr>
+        <w:t>العمليات وعقود التوسعة</w:t>
+      </w:r>
+    </w:p>
+    <w:p>
+      <w:pPr>
+        <w:bidi w:val="1"/>
+        <w:jc w:val="start"/>
+      </w:pPr>
+      <w:r>
+        <w:rPr>
+          <w:lang w:val="ar-SA" w:bidi="ar-SA"/>
+          <w:rtl w:val="1"/>
+        </w:rPr>
+        <w:t>عاين الفواتير المفقودة قبل اختيار الطلبات القديمة. لا طباعة أثناء المعاينة. التواريخ ‎UTC‎ وبحد أقصى ٣١ يوما.</w:t>
+      </w:r>
+    </w:p>
+    <w:p>
+      <w:pPr>
+        <w:bidi w:val="1"/>
+        <w:jc w:val="start"/>
+      </w:pPr>
+      <w:r>
+        <w:rPr>
+          <w:lang w:val="ar-SA" w:bidi="ar-SA"/>
+          <w:rtl w:val="1"/>
+        </w:rPr>
+        <w:t>يستخدم التجهيز تخزينا مستقلا. لا تتغير دفعات ‎WooCommerce‎ أو حالات الطلب وتواريخه.</w:t>
+      </w:r>
+    </w:p>
+    <w:p>
+      <w:pPr>
+        <w:bidi w:val="1"/>
+        <w:jc w:val="start"/>
+      </w:pPr>
+      <w:r>
+        <w:rPr>
+          <w:lang w:val="ar-SA" w:bidi="ar-SA"/>
+          <w:rtl w:val="1"/>
+        </w:rPr>
+        <w:t>استخدم ماسح لوحة مفاتيح أو أدخل المرجع. يتطلب المسح تسجيل الدخول ولا يؤكد الطباعة الفعلية.</w:t>
+      </w:r>
+    </w:p>
+    <w:p>
+      <w:pPr>
+        <w:bidi w:val="1"/>
+        <w:jc w:val="start"/>
+      </w:pPr>
+      <w:r>
+        <w:rPr>
+          <w:lang w:val="ar-SA" w:bidi="ar-SA"/>
+          <w:rtl w:val="1"/>
+        </w:rPr>
+        <w:t>التصدير معطل افتراضيا. يجب تنفيذ توقيع ‎HMAC‎ ومنع الإعادة وإيصال عدم التكرار. القبول لا يثبت الشحن أو الالتقاط. الأسرار غير مشفرة في قاعدة البيانات؛ استخدم ‎WCIP_EXPORT_SIGNING_SECRET.‎</w:t>
+      </w:r>
+    </w:p>
+    <w:p>
+      <w:pPr>
+        <w:pStyle w:val="Code"/>
+        <w:bidi w:val="0"/>
+        <w:jc w:val="start"/>
+      </w:pPr>
+      <w:r>
+        <w:rPr>
+          <w:lang w:val="ar-SA" w:bidi="ar-SA"/>
+          <w:rtl w:val="0"/>
+        </w:rPr>
+        <w:t>1.4.0 · 2026-10-10 · c894eb05d2120a4bba09aa3500fe2842a0e48d74</w:t>
+      </w:r>
+    </w:p>
+    <w:p>
+      <w:pPr>
+        <w:pStyle w:val="Code"/>
+        <w:bidi w:val="0"/>
+        <w:jc w:val="start"/>
+      </w:pPr>
+      <w:r>
+        <w:rPr>
+          <w:lang w:val="ar-SA" w:bidi="ar-SA"/>
+          <w:rtl w:val="0"/>
+        </w:rPr>
+        <w:t>docs/operations.md · REMEDIATION_TRACEABILITY.md</w:t>
+      </w:r>
+    </w:p>
+    <w:tbl>
+      <w:tblPr>
+        <w:tblW w:type="auto" w:w="0"/>
+        <w:tblLook w:firstColumn="1" w:firstRow="1" w:lastColumn="0" w:lastRow="0" w:noHBand="0" w:noVBand="1" w:val="04A0"/>
+        <w:bidiVisual w:val="1"/>
+        <w:tblBorders>
+          <w:top w:val="single" w:sz="4" w:color="D9D9D9"/>
+          <w:left w:val="single" w:sz="4" w:color="D9D9D9"/>
+          <w:bottom w:val="single" w:sz="4" w:color="D9D9D9"/>
+          <w:right w:val="single" w:sz="4" w:color="D9D9D9"/>
+          <w:insideH w:val="single" w:sz="4" w:color="D9D9D9"/>
+          <w:insideV w:val="single" w:sz="4" w:color="D9D9D9"/>
+        </w:tblBorders>
+      </w:tblPr>
+      <w:tblGrid>
+        <w:gridCol w:w="5112"/>
+        <w:gridCol w:w="5112"/>
+      </w:tblGrid>
+      <w:tr>
+        <w:trPr>
+          <w:tblHeader/>
+          <w:cantSplit/>
+        </w:trPr>
+        <w:tc>
+          <w:tcPr>
+            <w:tcW w:type="dxa" w:w="5112"/>
+            <w:vAlign w:val="center"/>
+            <w:shd w:fill="D9D9D9" w:val="clear"/>
+          </w:tcPr>
+          <w:p>
+            <w:pPr>
+              <w:bidi w:val="1"/>
+              <w:jc w:val="right"/>
+            </w:pPr>
+            <w:r>
+              <w:rPr>
+                <w:lang w:val="ar-SA" w:bidi="ar-SA"/>
+                <w:b/>
+                <w:rtl w:val="1"/>
+              </w:rPr>
+              <w:t>نقطة التوسعة</w:t>
+            </w:r>
+          </w:p>
+        </w:tc>
+        <w:tc>
+          <w:tcPr>
+            <w:tcW w:type="dxa" w:w="5112"/>
+            <w:vAlign w:val="center"/>
+            <w:shd w:fill="D9D9D9" w:val="clear"/>
+          </w:tcPr>
+          <w:p>
+            <w:pPr>
+              <w:bidi w:val="1"/>
+              <w:jc w:val="right"/>
+            </w:pPr>
+            <w:r>
+              <w:rPr>
+                <w:lang w:val="ar-SA" w:bidi="ar-SA"/>
+                <w:b/>
+                <w:rtl w:val="1"/>
+              </w:rPr>
+              <w:t>النوع والوسائط</w:t>
+            </w:r>
+          </w:p>
+        </w:tc>
+      </w:tr>
+      <w:tr>
+        <w:trPr>
+          <w:cantSplit/>
+        </w:trPr>
+        <w:tc>
+          <w:tcPr>
+            <w:tcW w:type="dxa" w:w="5112"/>
+            <w:vAlign w:val="center"/>
+          </w:tcPr>
+          <w:p>
+            <w:pPr>
+              <w:bidi w:val="0"/>
+              <w:jc w:val="start"/>
+            </w:pPr>
+            <w:r>
+              <w:rPr>
+                <w:lang w:val="ar-SA" w:bidi="ar-SA"/>
+                <w:rtl w:val="0"/>
+              </w:rPr>
+              <w:t>wcip_payment_method_semantics</w:t>
+            </w:r>
+          </w:p>
+        </w:tc>
+        <w:tc>
+          <w:tcPr>
+            <w:tcW w:type="dxa" w:w="5112"/>
+            <w:vAlign w:val="center"/>
+          </w:tcPr>
+          <w:p>
+            <w:r>
+              <w:t>string, WC_Order, gateway → string</w:t>
+            </w:r>
+          </w:p>
+        </w:tc>
+      </w:tr>
+      <w:tr>
+        <w:trPr>
+          <w:cantSplit/>
+        </w:trPr>
+        <w:tc>
+          <w:tcPr>
+            <w:tcW w:type="dxa" w:w="5112"/>
+            <w:vAlign w:val="center"/>
+          </w:tcPr>
+          <w:p>
+            <w:pPr>
+              <w:bidi w:val="0"/>
+              <w:jc w:val="start"/>
+            </w:pPr>
+            <w:r>
+              <w:rPr>
+                <w:lang w:val="ar-SA" w:bidi="ar-SA"/>
+                <w:rtl w:val="0"/>
+              </w:rPr>
+              <w:t>wcip_payment_confirmed</w:t>
+            </w:r>
+          </w:p>
+        </w:tc>
+        <w:tc>
+          <w:tcPr>
+            <w:tcW w:type="dxa" w:w="5112"/>
+            <w:vAlign w:val="center"/>
+          </w:tcPr>
+          <w:p>
+            <w:r>
+              <w:t>bool, WC_Order, semantics → bool</w:t>
+            </w:r>
+          </w:p>
+        </w:tc>
+      </w:tr>
+      <w:tr>
+        <w:trPr>
+          <w:cantSplit/>
+        </w:trPr>
+        <w:tc>
+          <w:tcPr>
+            <w:tcW w:type="dxa" w:w="5112"/>
+            <w:vAlign w:val="center"/>
+          </w:tcPr>
+          <w:p>
+            <w:pPr>
+              <w:bidi w:val="0"/>
+              <w:jc w:val="start"/>
+            </w:pPr>
+            <w:r>
+              <w:rPr>
+                <w:lang w:val="ar-SA" w:bidi="ar-SA"/>
+                <w:rtl w:val="0"/>
+              </w:rPr>
+              <w:t>wcip_fulfillment_eligible</w:t>
+            </w:r>
+          </w:p>
+        </w:tc>
+        <w:tc>
+          <w:tcPr>
+            <w:tcW w:type="dxa" w:w="5112"/>
+            <w:vAlign w:val="center"/>
+          </w:tcPr>
+          <w:p>
+            <w:pPr>
+              <w:bidi w:val="0"/>
+              <w:jc w:val="start"/>
+            </w:pPr>
+            <w:r>
+              <w:rPr>
+                <w:lang w:val="ar-SA" w:bidi="ar-SA"/>
+                <w:rtl w:val="0"/>
+              </w:rPr>
+              <w:t>bool, WC_Order → bool</w:t>
+            </w:r>
+          </w:p>
+        </w:tc>
+      </w:tr>
+      <w:tr>
+        <w:trPr>
+          <w:cantSplit/>
+        </w:trPr>
+        <w:tc>
+          <w:tcPr>
+            <w:tcW w:type="dxa" w:w="5112"/>
+            <w:vAlign w:val="center"/>
+          </w:tcPr>
+          <w:p>
+            <w:pPr>
+              <w:bidi w:val="0"/>
+              <w:jc w:val="start"/>
+            </w:pPr>
+            <w:r>
+              <w:rPr>
+                <w:lang w:val="ar-SA" w:bidi="ar-SA"/>
+                <w:rtl w:val="0"/>
+              </w:rPr>
+              <w:t>wcip_recipient_data</w:t>
+            </w:r>
+          </w:p>
+        </w:tc>
+        <w:tc>
+          <w:tcPr>
+            <w:tcW w:type="dxa" w:w="5112"/>
+            <w:vAlign w:val="center"/>
+          </w:tcPr>
+          <w:p>
+            <w:pPr>
+              <w:bidi w:val="0"/>
+              <w:jc w:val="start"/>
+            </w:pPr>
+            <w:r>
+              <w:rPr>
+                <w:lang w:val="ar-SA" w:bidi="ar-SA"/>
+                <w:rtl w:val="0"/>
+              </w:rPr>
+              <w:t>array, WC_Order → array</w:t>
+            </w:r>
+          </w:p>
+        </w:tc>
+      </w:tr>
+      <w:tr>
+        <w:trPr>
+          <w:cantSplit/>
+        </w:trPr>
+        <w:tc>
+          <w:tcPr>
+            <w:tcW w:type="dxa" w:w="5112"/>
+            <w:vAlign w:val="center"/>
+          </w:tcPr>
+          <w:p>
+            <w:pPr>
+              <w:bidi w:val="0"/>
+              <w:jc w:val="start"/>
+            </w:pPr>
+            <w:r>
+              <w:rPr>
+                <w:lang w:val="ar-SA" w:bidi="ar-SA"/>
+                <w:rtl w:val="0"/>
+              </w:rPr>
+              <w:t>wcip_item_weight</w:t>
+            </w:r>
+          </w:p>
+        </w:tc>
+        <w:tc>
+          <w:tcPr>
+            <w:tcW w:type="dxa" w:w="5112"/>
+            <w:vAlign w:val="center"/>
+          </w:tcPr>
+          <w:p>
+            <w:r>
+              <w:t>array, WC_Order_Item_Product, quantity → array</w:t>
+            </w:r>
+          </w:p>
+        </w:tc>
+      </w:tr>
+      <w:tr>
+        <w:trPr>
+          <w:cantSplit/>
+        </w:trPr>
+        <w:tc>
+          <w:tcPr>
+            <w:tcW w:type="dxa" w:w="5112"/>
+            <w:vAlign w:val="center"/>
+          </w:tcPr>
+          <w:p>
+            <w:pPr>
+              <w:bidi w:val="0"/>
+              <w:jc w:val="start"/>
+            </w:pPr>
+            <w:r>
+              <w:rPr>
+                <w:lang w:val="ar-SA" w:bidi="ar-SA"/>
+                <w:rtl w:val="0"/>
+              </w:rPr>
+              <w:t>wcip_print_filter_query_args</w:t>
+            </w:r>
+          </w:p>
+        </w:tc>
+        <w:tc>
+          <w:tcPr>
+            <w:tcW w:type="dxa" w:w="5112"/>
+            <w:vAlign w:val="center"/>
+          </w:tcPr>
+          <w:p>
+            <w:pPr>
+              <w:bidi w:val="0"/>
+              <w:jc w:val="start"/>
+            </w:pPr>
+            <w:r>
+              <w:rPr>
+                <w:lang w:val="ar-SA" w:bidi="ar-SA"/>
+                <w:rtl w:val="0"/>
+              </w:rPr>
+              <w:t>array → array</w:t>
+            </w:r>
+          </w:p>
+        </w:tc>
+      </w:tr>
+      <w:tr>
+        <w:trPr>
+          <w:cantSplit/>
+        </w:trPr>
+        <w:tc>
+          <w:tcPr>
+            <w:tcW w:type="dxa" w:w="5112"/>
+            <w:vAlign w:val="center"/>
+          </w:tcPr>
+          <w:p>
+            <w:pPr>
+              <w:bidi w:val="0"/>
+              <w:jc w:val="start"/>
+            </w:pPr>
+            <w:r>
+              <w:rPr>
+                <w:lang w:val="ar-SA" w:bidi="ar-SA"/>
+                <w:rtl w:val="0"/>
+              </w:rPr>
+              <w:t>wcip_can_access_order</w:t>
+            </w:r>
+          </w:p>
+        </w:tc>
+        <w:tc>
+          <w:tcPr>
+            <w:tcW w:type="dxa" w:w="5112"/>
+            <w:vAlign w:val="center"/>
+          </w:tcPr>
+          <w:p>
+            <w:pPr>
+              <w:bidi w:val="0"/>
+              <w:jc w:val="start"/>
+            </w:pPr>
+            <w:r>
+              <w:rPr>
+                <w:lang w:val="ar-SA" w:bidi="ar-SA"/>
+                <w:rtl w:val="0"/>
+              </w:rPr>
+              <w:t>bool, WC_Order, capability → bool</w:t>
+            </w:r>
+          </w:p>
+        </w:tc>
+      </w:tr>
+      <w:tr>
+        <w:trPr>
+          <w:cantSplit/>
+        </w:trPr>
+        <w:tc>
+          <w:tcPr>
+            <w:tcW w:type="dxa" w:w="5112"/>
+            <w:vAlign w:val="center"/>
+          </w:tcPr>
+          <w:p>
+            <w:pPr>
+              <w:bidi w:val="0"/>
+              <w:jc w:val="start"/>
+            </w:pPr>
+            <w:r>
+              <w:rPr>
+                <w:lang w:val="ar-SA" w:bidi="ar-SA"/>
+                <w:rtl w:val="0"/>
+              </w:rPr>
+              <w:t>wcip_print_confirmed</w:t>
+            </w:r>
+          </w:p>
+        </w:tc>
+        <w:tc>
+          <w:tcPr>
+            <w:tcW w:type="dxa" w:w="5112"/>
+            <w:vAlign w:val="center"/>
+          </w:tcPr>
+          <w:p>
+            <w:pPr>
+              <w:bidi w:val="0"/>
+              <w:jc w:val="start"/>
+            </w:pPr>
+            <w:r>
+              <w:rPr>
+                <w:lang w:val="ar-SA" w:bidi="ar-SA"/>
+                <w:rtl w:val="0"/>
+              </w:rPr>
+              <w:t>job array; after commit</w:t>
+            </w:r>
+          </w:p>
+        </w:tc>
+      </w:tr>
+      <w:tr>
+        <w:trPr>
+          <w:cantSplit/>
+        </w:trPr>
+        <w:tc>
+          <w:tcPr>
+            <w:tcW w:type="dxa" w:w="5112"/>
+            <w:vAlign w:val="center"/>
+          </w:tcPr>
+          <w:p>
+            <w:pPr>
+              <w:bidi w:val="0"/>
+              <w:jc w:val="start"/>
+            </w:pPr>
+            <w:r>
+              <w:rPr>
+                <w:lang w:val="ar-SA" w:bidi="ar-SA"/>
+                <w:rtl w:val="0"/>
+              </w:rPr>
+              <w:t>wcip_fulfillment_changed</w:t>
+            </w:r>
+          </w:p>
+        </w:tc>
+        <w:tc>
+          <w:tcPr>
+            <w:tcW w:type="dxa" w:w="5112"/>
+            <w:vAlign w:val="center"/>
+          </w:tcPr>
+          <w:p>
+            <w:pPr>
+              <w:bidi w:val="0"/>
+              <w:jc w:val="start"/>
+            </w:pPr>
+            <w:r>
+              <w:rPr>
+                <w:lang w:val="ar-SA" w:bidi="ar-SA"/>
+                <w:rtl w:val="0"/>
+              </w:rPr>
+              <w:t>state array, event string; after commit</w:t>
+            </w:r>
+          </w:p>
+        </w:tc>
+      </w:tr>
+      <w:tr>
+        <w:trPr>
+          <w:cantSplit/>
+        </w:trPr>
+        <w:tc>
+          <w:tcPr>
+            <w:tcW w:type="dxa" w:w="5112"/>
+            <w:vAlign w:val="center"/>
+          </w:tcPr>
+          <w:p>
+            <w:pPr>
+              <w:bidi w:val="0"/>
+              <w:jc w:val="start"/>
+            </w:pPr>
+            <w:r>
+              <w:rPr>
+                <w:lang w:val="ar-SA" w:bidi="ar-SA"/>
+                <w:rtl w:val="0"/>
+              </w:rPr>
+              <w:t>wcip_export_adapter</w:t>
+            </w:r>
+          </w:p>
+        </w:tc>
+        <w:tc>
+          <w:tcPr>
+            <w:tcW w:type="dxa" w:w="5112"/>
+            <w:vAlign w:val="center"/>
+          </w:tcPr>
+          <w:p>
+            <w:pPr>
+              <w:bidi w:val="0"/>
+              <w:jc w:val="start"/>
+            </w:pPr>
+            <w:r>
+              <w:rPr>
+                <w:lang w:val="ar-SA" w:bidi="ar-SA"/>
+                <w:rtl w:val="0"/>
+              </w:rPr>
+              <w:t>ExportAdapterInterface, SettingsRepository → adapter</w:t>
+            </w:r>
+          </w:p>
+        </w:tc>
+      </w:tr>
+      <w:tr>
+        <w:trPr>
+          <w:cantSplit/>
+        </w:trPr>
+        <w:tc>
+          <w:tcPr>
+            <w:tcW w:type="dxa" w:w="5112"/>
+            <w:vAlign w:val="center"/>
+          </w:tcPr>
+          <w:p>
+            <w:pPr>
+              <w:bidi w:val="0"/>
+              <w:jc w:val="start"/>
+            </w:pPr>
+            <w:r>
+              <w:rPr>
+                <w:lang w:val="ar-SA" w:bidi="ar-SA"/>
+                <w:rtl w:val="0"/>
+              </w:rPr>
+              <w:t>wcip_export_payload</w:t>
+            </w:r>
+          </w:p>
+        </w:tc>
+        <w:tc>
+          <w:tcPr>
+            <w:tcW w:type="dxa" w:w="5112"/>
+            <w:vAlign w:val="center"/>
+          </w:tcPr>
+          <w:p>
+            <w:pPr>
+              <w:bidi w:val="0"/>
+              <w:jc w:val="start"/>
+            </w:pPr>
+            <w:r>
+              <w:rPr>
+                <w:lang w:val="ar-SA" w:bidi="ar-SA"/>
+                <w:rtl w:val="0"/>
+              </w:rPr>
+              <w:t>array, WC_Order, package_id → array</w:t>
+            </w:r>
+          </w:p>
+        </w:tc>
+      </w:tr>
+    </w:tbl>
+    <w:p>
+      <w:pPr>
+        <w:spacing w:before="0" w:after="0" w:line="20" w:lineRule="exact"/>
+      </w:pPr>
+    </w:p>
+    <w:tbl>
+      <w:tblPr>
+        <w:tblW w:type="auto" w:w="0"/>
+        <w:tblLook w:firstColumn="1" w:firstRow="1" w:lastColumn="0" w:lastRow="0" w:noHBand="0" w:noVBand="1" w:val="04A0"/>
+        <w:bidiVisual w:val="1"/>
+        <w:tblBorders>
+          <w:top w:val="single" w:sz="4" w:color="D9D9D9"/>
+          <w:left w:val="single" w:sz="4" w:color="D9D9D9"/>
+          <w:bottom w:val="single" w:sz="4" w:color="D9D9D9"/>
+          <w:right w:val="single" w:sz="4" w:color="D9D9D9"/>
+          <w:insideH w:val="single" w:sz="4" w:color="D9D9D9"/>
+          <w:insideV w:val="single" w:sz="4" w:color="D9D9D9"/>
+        </w:tblBorders>
+      </w:tblPr>
+      <w:tblGrid>
+        <w:gridCol w:w="5112"/>
+        <w:gridCol w:w="5112"/>
+      </w:tblGrid>
+      <w:tr>
+        <w:trPr>
+          <w:tblHeader/>
+          <w:cantSplit/>
+        </w:trPr>
+        <w:tc>
+          <w:tcPr>
+            <w:tcW w:type="dxa" w:w="5112"/>
+            <w:vAlign w:val="center"/>
+            <w:shd w:fill="D9D9D9" w:val="clear"/>
+          </w:tcPr>
+          <w:p>
+            <w:pPr>
+              <w:bidi w:val="1"/>
+              <w:jc w:val="right"/>
+            </w:pPr>
+            <w:r>
+              <w:rPr>
+                <w:lang w:val="ar-SA" w:bidi="ar-SA"/>
+                <w:b/>
+                <w:rtl w:val="1"/>
+              </w:rPr>
+              <w:t>الطريقة والمسار</w:t>
+            </w:r>
+          </w:p>
+        </w:tc>
+        <w:tc>
+          <w:tcPr>
+            <w:tcW w:type="dxa" w:w="5112"/>
+            <w:vAlign w:val="center"/>
+            <w:shd w:fill="D9D9D9" w:val="clear"/>
+          </w:tcPr>
+          <w:p>
+            <w:pPr>
+              <w:bidi w:val="1"/>
+              <w:jc w:val="right"/>
+            </w:pPr>
+            <w:r>
+              <w:rPr>
+                <w:lang w:val="ar-SA" w:bidi="ar-SA"/>
+                <w:b/>
+                <w:rtl w:val="1"/>
+              </w:rPr>
+              <w:t>الصلاحية المطلوبة</w:t>
+            </w:r>
+          </w:p>
+        </w:tc>
+      </w:tr>
+      <w:tr>
+        <w:trPr>
+          <w:cantSplit/>
+        </w:trPr>
+        <w:tc>
+          <w:tcPr>
+            <w:tcW w:type="dxa" w:w="5112"/>
+            <w:vAlign w:val="center"/>
+          </w:tcPr>
+          <w:p>
+            <w:pPr>
+              <w:bidi w:val="0"/>
+              <w:jc w:val="start"/>
+            </w:pPr>
+            <w:r>
+              <w:rPr>
+                <w:lang w:val="ar-SA" w:bidi="ar-SA"/>
+                <w:rtl w:val="0"/>
+              </w:rPr>
+              <w:t>POST /reconciliation/preview</w:t>
+            </w:r>
+          </w:p>
+        </w:tc>
+        <w:tc>
+          <w:tcPr>
+            <w:tcW w:type="dxa" w:w="5112"/>
+            <w:vAlign w:val="center"/>
+          </w:tcPr>
+          <w:p>
+            <w:pPr>
+              <w:bidi w:val="0"/>
+              <w:jc w:val="start"/>
+            </w:pPr>
+            <w:r>
+              <w:rPr>
+                <w:lang w:val="ar-SA" w:bidi="ar-SA"/>
+                <w:rtl w:val="0"/>
+              </w:rPr>
+              <w:t>wcip_manage_settings + wcip_print_invoices</w:t>
+            </w:r>
+          </w:p>
+        </w:tc>
+      </w:tr>
+      <w:tr>
+        <w:trPr>
+          <w:cantSplit/>
+        </w:trPr>
+        <w:tc>
+          <w:tcPr>
+            <w:tcW w:type="dxa" w:w="5112"/>
+            <w:vAlign w:val="center"/>
+          </w:tcPr>
+          <w:p>
+            <w:pPr>
+              <w:bidi w:val="0"/>
+              <w:jc w:val="start"/>
+            </w:pPr>
+            <w:r>
+              <w:rPr>
+                <w:lang w:val="ar-SA" w:bidi="ar-SA"/>
+                <w:rtl w:val="0"/>
+              </w:rPr>
+              <w:t>POST /reconciliation/enqueue</w:t>
+            </w:r>
+          </w:p>
+        </w:tc>
+        <w:tc>
+          <w:tcPr>
+            <w:tcW w:type="dxa" w:w="5112"/>
+            <w:vAlign w:val="center"/>
+          </w:tcPr>
+          <w:p>
+            <w:pPr>
+              <w:bidi w:val="0"/>
+              <w:jc w:val="start"/>
+            </w:pPr>
+            <w:r>
+              <w:rPr>
+                <w:lang w:val="ar-SA" w:bidi="ar-SA"/>
+                <w:rtl w:val="0"/>
+              </w:rPr>
+              <w:t>same + user-bound token + confirm:true</w:t>
+            </w:r>
+          </w:p>
+        </w:tc>
+      </w:tr>
+      <w:tr>
+        <w:trPr>
+          <w:cantSplit/>
+        </w:trPr>
+        <w:tc>
+          <w:tcPr>
+            <w:tcW w:type="dxa" w:w="5112"/>
+            <w:vAlign w:val="center"/>
+          </w:tcPr>
+          <w:p>
+            <w:pPr>
+              <w:bidi w:val="0"/>
+              <w:jc w:val="start"/>
+            </w:pPr>
+            <w:r>
+              <w:rPr>
+                <w:lang w:val="ar-SA" w:bidi="ar-SA"/>
+                <w:rtl w:val="0"/>
+              </w:rPr>
+              <w:t>POST /scan</w:t>
+            </w:r>
+          </w:p>
+        </w:tc>
+        <w:tc>
+          <w:tcPr>
+            <w:tcW w:type="dxa" w:w="5112"/>
+            <w:vAlign w:val="center"/>
+          </w:tcPr>
+          <w:p>
+            <w:pPr>
+              <w:bidi w:val="0"/>
+              <w:jc w:val="start"/>
+            </w:pPr>
+            <w:r>
+              <w:rPr>
+                <w:lang w:val="ar-SA" w:bidi="ar-SA"/>
+                <w:rtl w:val="0"/>
+              </w:rPr>
+              <w:t>wcip_scan_orders + order access</w:t>
+            </w:r>
+          </w:p>
+        </w:tc>
+      </w:tr>
+      <w:tr>
+        <w:trPr>
+          <w:cantSplit/>
+        </w:trPr>
+        <w:tc>
+          <w:tcPr>
+            <w:tcW w:type="dxa" w:w="5112"/>
+            <w:vAlign w:val="center"/>
+          </w:tcPr>
+          <w:p>
+            <w:pPr>
+              <w:bidi w:val="0"/>
+              <w:jc w:val="start"/>
+            </w:pPr>
+            <w:r>
+              <w:rPr>
+                <w:lang w:val="ar-SA" w:bidi="ar-SA"/>
+                <w:rtl w:val="0"/>
+              </w:rPr>
+              <w:t>POST /fulfillment/{id}</w:t>
+            </w:r>
+          </w:p>
+        </w:tc>
+        <w:tc>
+          <w:tcPr>
+            <w:tcW w:type="dxa" w:w="5112"/>
+            <w:vAlign w:val="center"/>
+          </w:tcPr>
+          <w:p>
+            <w:pPr>
+              <w:bidi w:val="0"/>
+              <w:jc w:val="start"/>
+            </w:pPr>
+            <w:r>
+              <w:rPr>
+                <w:lang w:val="ar-SA" w:bidi="ar-SA"/>
+                <w:rtl w:val="0"/>
+              </w:rPr>
+              <w:t>wcip_manage_fulfillment + order access + revision</w:t>
+            </w:r>
+          </w:p>
+        </w:tc>
+      </w:tr>
+      <w:tr>
+        <w:trPr>
+          <w:cantSplit/>
+        </w:trPr>
+        <w:tc>
+          <w:tcPr>
+            <w:tcW w:type="dxa" w:w="5112"/>
+            <w:vAlign w:val="center"/>
+          </w:tcPr>
+          <w:p>
+            <w:pPr>
+              <w:bidi w:val="0"/>
+              <w:jc w:val="start"/>
+            </w:pPr>
+            <w:r>
+              <w:rPr>
+                <w:lang w:val="ar-SA" w:bidi="ar-SA"/>
+                <w:rtl w:val="0"/>
+              </w:rPr>
+              <w:t>POST /exports</w:t>
+            </w:r>
+          </w:p>
+        </w:tc>
+        <w:tc>
+          <w:tcPr>
+            <w:tcW w:type="dxa" w:w="5112"/>
+            <w:vAlign w:val="center"/>
+          </w:tcPr>
+          <w:p>
+            <w:pPr>
+              <w:bidi w:val="0"/>
+              <w:jc w:val="start"/>
+            </w:pPr>
+            <w:r>
+              <w:rPr>
+                <w:lang w:val="ar-SA" w:bidi="ar-SA"/>
+                <w:rtl w:val="0"/>
+              </w:rPr>
+              <w:t>wcip_export_orders + order access + event_key</w:t>
+            </w:r>
+          </w:p>
+        </w:tc>
+      </w:tr>
+      <w:tr>
+        <w:trPr>
+          <w:cantSplit/>
+        </w:trPr>
+        <w:tc>
+          <w:tcPr>
+            <w:tcW w:type="dxa" w:w="5112"/>
+            <w:vAlign w:val="center"/>
+          </w:tcPr>
+          <w:p>
+            <w:pPr>
+              <w:bidi w:val="0"/>
+              <w:jc w:val="start"/>
+            </w:pPr>
+            <w:r>
+              <w:rPr>
+                <w:lang w:val="ar-SA" w:bidi="ar-SA"/>
+                <w:rtl w:val="0"/>
+              </w:rPr>
+              <w:t>GET /exports/history</w:t>
+            </w:r>
+          </w:p>
+        </w:tc>
+        <w:tc>
+          <w:tcPr>
+            <w:tcW w:type="dxa" w:w="5112"/>
+            <w:vAlign w:val="center"/>
+          </w:tcPr>
+          <w:p>
+            <w:pPr>
+              <w:bidi w:val="0"/>
+              <w:jc w:val="start"/>
+            </w:pPr>
+            <w:r>
+              <w:rPr>
+                <w:lang w:val="ar-SA" w:bidi="ar-SA"/>
+                <w:rtl w:val="0"/>
+              </w:rPr>
+              <w:t>wcip_export_orders</w:t>
+            </w:r>
+          </w:p>
+        </w:tc>
+      </w:tr>
+      <w:tr>
+        <w:trPr>
+          <w:cantSplit/>
+        </w:trPr>
+        <w:tc>
+          <w:tcPr>
+            <w:tcW w:type="dxa" w:w="5112"/>
+            <w:vAlign w:val="center"/>
+          </w:tcPr>
+          <w:p>
+            <w:pPr>
+              <w:bidi w:val="0"/>
+              <w:jc w:val="start"/>
+            </w:pPr>
+            <w:r>
+              <w:rPr>
+                <w:lang w:val="ar-SA" w:bidi="ar-SA"/>
+                <w:rtl w:val="0"/>
+              </w:rPr>
+              <w:t>POST /exports/test</w:t>
+            </w:r>
+          </w:p>
+        </w:tc>
+        <w:tc>
+          <w:tcPr>
+            <w:tcW w:type="dxa" w:w="5112"/>
+            <w:vAlign w:val="center"/>
+          </w:tcPr>
+          <w:p>
+            <w:pPr>
+              <w:bidi w:val="0"/>
+              <w:jc w:val="start"/>
+            </w:pPr>
+            <w:r>
+              <w:rPr>
+                <w:lang w:val="ar-SA" w:bidi="ar-SA"/>
+                <w:rtl w:val="0"/>
+              </w:rPr>
+              <w:t>wcip_export_orders + wcip_manage_settings</w:t>
+            </w:r>
+          </w:p>
+        </w:tc>
+      </w:tr>
+      <w:tr>
+        <w:trPr>
+          <w:cantSplit/>
+        </w:trPr>
+        <w:tc>
+          <w:tcPr>
+            <w:tcW w:type="dxa" w:w="5112"/>
+            <w:vAlign w:val="center"/>
+          </w:tcPr>
+          <w:p>
+            <w:pPr>
+              <w:bidi w:val="0"/>
+              <w:jc w:val="start"/>
+            </w:pPr>
+            <w:r>
+              <w:rPr>
+                <w:lang w:val="ar-SA" w:bidi="ar-SA"/>
+                <w:rtl w:val="0"/>
+              </w:rPr>
+              <w:t>GET /diagnostics</w:t>
+            </w:r>
+          </w:p>
+        </w:tc>
+        <w:tc>
+          <w:tcPr>
+            <w:tcW w:type="dxa" w:w="5112"/>
+            <w:vAlign w:val="center"/>
+          </w:tcPr>
+          <w:p>
+            <w:pPr>
+              <w:bidi w:val="0"/>
+              <w:jc w:val="start"/>
+            </w:pPr>
+            <w:r>
+              <w:rPr>
+                <w:lang w:val="ar-SA" w:bidi="ar-SA"/>
+                <w:rtl w:val="0"/>
+              </w:rPr>
+              <w:t>wcip_manage_settings + wcip_print_invoices</w:t>
+            </w:r>
+          </w:p>
+        </w:tc>
+      </w:tr>
+    </w:tbl>
+    <w:p>
+      <w:pPr>
+        <w:pStyle w:val="Code"/>
+        <w:bidi w:val="0"/>
+        <w:jc w:val="start"/>
+      </w:pPr>
+      <w:r>
+        <w:rPr>
+          <w:lang w:val="ar-SA" w:bidi="ar-SA"/>
+          <w:rtl w:val="0"/>
+        </w:rPr>
+        <w:t>TemplateDefinition(id, name, description, paper_size, orientation, supports_rtl, file_path, document_type = "invoice")</w:t>
+      </w:r>
+    </w:p>
+    <w:p>
+      <w:pPr>
+        <w:pStyle w:val="Code"/>
+        <w:bidi w:val="0"/>
+        <w:jc w:val="start"/>
+      </w:pPr>
+      <w:r>
+        <w:rPr>
+          <w:lang w:val="ar-SA" w:bidi="ar-SA"/>
+          <w:rtl w:val="0"/>
+        </w:rPr>
+        <w:t>document_type: invoice | shipping_label | packing_list</w:t>
+        <w:br/>
+        <w:t>ExportAdapterInterface: id(), capabilities(), validate_configuration(), test_connection(), submit(payload, idempotency_key)</w:t>
+      </w:r>
+    </w:p>
+    <w:p>
+      <w:pPr>
+        <w:pStyle w:val="Code"/>
+        <w:bidi w:val="0"/>
+        <w:jc w:val="start"/>
+      </w:pPr>
+      <w:r>
+        <w:rPr>
+          <w:lang w:val="ar-SA" w:bidi="ar-SA"/>
+          <w:rtl w:val="0"/>
+        </w:rPr>
+        <w:t>wcip_runtime_leases · wcip_document_references · wcip_fulfillment · wcip_fulfillment_events · wcip_export_outbox</w:t>
+      </w:r>
+    </w:p>
+    <w:p>
+      <w:pPr>
+        <w:bidi w:val="1"/>
+        <w:jc w:val="start"/>
+      </w:pPr>
+      <w:r>
+        <w:rPr>
+          <w:lang w:val="ar-SA" w:bidi="ar-SA" w:eastAsia="ar-SA"/>
+          <w:color w:val="000000"/>
+          <w:rtl w:val="1"/>
+          <w:rFonts w:ascii="Arial" w:hAnsi="Arial" w:eastAsia="Arial" w:cs="Arial"/>
+        </w:rPr>
+        <w:t>1.3.0: استخدم فقط مزودين وتطبيقات مفتوحة المصدر بلا اشتراك إلزامي أو رسوم لكل مهمة. يحل ‎‎CUPS‎‎ محل الخدمة التجارية السابقة. تحذف الترقية بيانات اتصالها وتعطل إعدادها التلقائي وتلغي المهام المنتظرة وتجعل الجارية غير مؤكدة. يبقى السجل المؤكد؛ لا تنتقل المهام القديمة تلقائيا إلى ‎‎CUPS.‎‎ أعد إعداد ‎‎CUPS‎‎ وافحص الصف والورق قبل إعادة الطباعة. أوقف العامل وخذ نسخة احتياطية قبل الترقية. حرر الأدلة بواسطة ‎‎LibreOffice.‎‎</w:t>
+      </w:r>
+    </w:p>
+    <w:p>
+      <w:pPr>
+        <w:pStyle w:val="Code"/>
+        <w:bidi w:val="0"/>
+        <w:spacing w:before="0" w:after="0"/>
+        <w:jc w:val="start"/>
+      </w:pPr>
+      <w:r>
+        <w:rPr>
+          <w:lang w:val="en-US" w:bidi="en-US" w:eastAsia="en-US"/>
+          <w:color w:val="000000"/>
+          <w:rtl w:val="0"/>
+          <w:rFonts w:ascii="Courier New" w:hAnsi="Courier New" w:eastAsia="Courier New" w:cs="Courier New"/>
+        </w:rPr>
+        <w:t>cups_endpoint: HTTPS origin 443/631; cups_printer_id: exact queue</w:t>
+        <w:br/>
+        <w:t>cups_username · cups_password · provider_id=cups</w:t>
+        <w:br/>
+        <w:t>WCIP_CUPS_PASSWORD · WCIP_CUPS_TRUSTED_HOSTS · WCIP_CUPS_CA_BUNDLE</w:t>
+        <w:br/>
+        <w:t>Migration 1.3.0 · schema 1.4.0 · docs/open-source-printing.md</w:t>
+      </w:r>
+    </w:p>
+    <w:p>
+      <w:pPr>
+        <w:pStyle w:val="Heading1"/>
+        <w:bidi w:val="1"/>
+        <w:jc w:val="start"/>
+      </w:pPr>
+      <w:r>
+        <w:rPr>
+          <w:lang w:val="ar-SA" w:bidi="ar-SA" w:eastAsia="ar-SA"/>
+          <w:color w:val="000000"/>
+          <w:rtl w:val="1"/>
+          <w:rFonts w:ascii="Arial" w:hAnsi="Arial" w:eastAsia="Arial" w:cs="Arial"/>
+        </w:rPr>
+        <w:t>الطباعة التلقائية عبر الأنظمة</w:t>
+      </w:r>
+    </w:p>
+    <w:p>
+      <w:pPr>
+        <w:bidi w:val="1"/>
+        <w:jc w:val="start"/>
+      </w:pPr>
+      <w:r>
+        <w:rPr>
+          <w:lang w:val="ar-SA" w:bidi="ar-SA" w:eastAsia="ar-SA"/>
+          <w:color w:val="000000"/>
+          <w:rtl w:val="1"/>
+          <w:rFonts w:ascii="Arial" w:hAnsi="Arial" w:eastAsia="Arial" w:cs="Arial"/>
+        </w:rPr>
+        <w:t>يمكن تثبيت ‎WordPress‎ على أي نظام مضيف مدعوم، مع استضافة مشتركة أو ‎VPS‎ أو خادم مخصص. يحتاج المضيف إلى امتدادات ‎PHP‎ المعلنة ومساحة مؤقتة قابلة للكتابة و‎HTTPS‎ ‎REST‎ مع كلمات مرور التطبيقات. لا يحتاج برنامج طباعة أو أوامر ‎shell‎ على المضيف. يحتاج حاسوب الطباعة إلى ‎Python‎ 3.10 أو أحدث واتصال ‎HTTPS‎ صادر؛ يستخدم ‎Windows‎ برنامج ‎SumatraPDF‎ المجاني المفتوح المصدر، ويستخدم ‎Linux‎ و‎macOS‎ أمر ‎CUPS‎ ‎lp.‎ أبق الحاسوب والطابعة جاهزين.</w:t>
+      </w:r>
+    </w:p>
+    <w:p>
+      <w:pPr>
+        <w:bidi w:val="1"/>
+        <w:jc w:val="start"/>
+      </w:pPr>
+      <w:r>
+        <w:rPr>
+          <w:lang w:val="ar-SA" w:bidi="ar-SA" w:eastAsia="ar-SA"/>
+          <w:color w:val="000000"/>
+          <w:rtl w:val="1"/>
+          <w:rFonts w:ascii="Arial" w:hAnsi="Arial" w:eastAsia="Arial" w:cs="Arial"/>
+        </w:rPr>
+        <w:t>أنشئ مستخدم وكيل طباعة مخصصا وكلمة مرور للتطبيق. اربط معرفه الرقمي والصف المنطقي الحساس لحالة الأحرف في الطابعات؛ انسخ عنوان ‎REST‎ المعروض إلى الإعداد المحلي. اربط الصف بطابعة مثبتة ومسار البرنامج ومرر كلمة المرور بمتغير بيئة. اختبر مهمة يدوية وافحص الورق قبل تفعيل وجهة الوكيل. في ‎Windows‎ استخدم ‎Task‎ ‎Scheduler‎ عند دخول مستخدم الطباعة، وفي ‎Linux‎ و‎macOS‎ مدير الخدمات. يجب استمرار تشغيل الوكيل؛ لا يلزم متصفح مفتوح.</w:t>
+      </w:r>
+    </w:p>
+    <w:p>
+      <w:pPr>
+        <w:bidi w:val="1"/>
+        <w:jc w:val="start"/>
+      </w:pPr>
+      <w:r>
+        <w:rPr>
+          <w:lang w:val="ar-SA" w:bidi="ar-SA" w:eastAsia="ar-SA"/>
+          <w:color w:val="000000"/>
+          <w:rtl w:val="1"/>
+          <w:rFonts w:ascii="Arial" w:hAnsi="Arial" w:eastAsia="Arial" w:cs="Arial"/>
+        </w:rPr>
+        <w:t>لا يجيز تنزيل ‎PDF‎ الطباعة حتى ينجح طلب البدء. تنتهي مهلة التحضير بعد ٦٠٠ ثانية ويمكن استعادتها؛ تصبح المهمة التي بدأت وانتهت مهلتها غير مؤكدة. يسجل سجل ‎SQLite‎ الدائم المحاولة قبل تشغيل الطابعة. بعد تعطل البرنامج يبلغ عن عدم اليقين دون تشغيل الطابعة مجددا؛ إعادة إرسال الإيصال لا تعيد الطباعة. احتفظ بالسجل عند الترقية وقيد الوصول إليه وإلى كلمة المرور. تم الإرسال يعني قبول الصف وليس تأكيد الورق.</w:t>
+      </w:r>
+    </w:p>
+    <w:p>
+      <w:pPr>
+        <w:bidi w:val="1"/>
+        <w:jc w:val="start"/>
+      </w:pPr>
+      <w:r>
+        <w:rPr>
+          <w:lang w:val="ar-SA" w:bidi="ar-SA" w:eastAsia="ar-SA"/>
+          <w:color w:val="000000"/>
+          <w:rtl w:val="1"/>
+          <w:rFonts w:ascii="Arial" w:hAnsi="Arial" w:eastAsia="Arial" w:cs="Arial"/>
+        </w:rPr>
+        <w:t>لدور الوكيل المحدود ‎read‎ و‎wcip_run_print_agent‎ فقط. تتطلب المطالبة والبدء والإيصال ‎HTTPS‎ ومصادقة فعلية بكلمة مرور التطبيق والمستخدم والصف المرتبطين والرمز الحالي. يحفظ المكون تجزئة الرمز ويتحقق من حجم ‎PDF‎ وتجزئته ويعيد فحص أهلية الطباعة التلقائية قبل البدء. طور الخلفية المحلية بقائمة معاملات ثابتة دون ‎shell‎؛ حافظ على ترتيب السجل الدائم ومعالجة النتائج غير المؤكدة واختبر على الأنظمة والطابعات الفعلية قبل النشر.</w:t>
+      </w:r>
+    </w:p>
+    <w:p>
+      <w:pPr>
+        <w:pStyle w:val="Code"/>
+        <w:bidi w:val="0"/>
+        <w:jc w:val="start"/>
+      </w:pPr>
+      <w:r>
+        <w:rPr>
+          <w:lang w:val="en-US" w:bidi="en-US" w:eastAsia="en-US"/>
+          <w:color w:val="000000"/>
+          <w:rtl w:val="0"/>
+          <w:rFonts w:ascii="Courier New" w:hAnsi="Courier New" w:eastAsia="Courier New" w:cs="Courier New"/>
+        </w:rPr>
+        <w:t>automatic_provider: agent | cups</w:t>
+        <w:br/>
+        <w:t>agent_user_id: paired numeric WordPress user ID</w:t>
+        <w:br/>
+        <w:t>agent_queue: Office (exact case, same on both sides)</w:t>
+        <w:br/>
+        <w:t>POST /agent/claim: route</w:t>
+        <w:br/>
+        <w:t>POST /agent/jobs/{id}/start: token</w:t>
+        <w:br/>
+        <w:t>POST /agent/jobs/{id}/receipt: token, outcome</w:t>
+        <w:br/>
+        <w:t>outcome: submitted | unknown | failed</w:t>
+      </w:r>
+    </w:p>
+    <w:p>
+      <w:pPr>
+        <w:pStyle w:val="Code"/>
+        <w:bidi w:val="0"/>
+        <w:jc w:val="start"/>
+      </w:pPr>
+      <w:r>
+        <w:rPr>
+          <w:lang w:val="en-US" w:bidi="en-US" w:eastAsia="en-US"/>
+          <w:color w:val="000000"/>
+          <w:rtl w:val="0"/>
+          <w:rFonts w:ascii="Courier New" w:hAnsi="Courier New" w:eastAsia="Courier New" w:cs="Courier New"/>
+        </w:rPr>
+        <w:t>print-agent/config.example.json -&gt; private config.json</w:t>
+        <w:br/>
+        <w:t>WCIP_AGENT_PASSWORD: WordPress Application Password</w:t>
+        <w:br/>
+        <w:t>Windows: python wcip_agent.py --config config.json</w:t>
+        <w:br/>
+        <w:t>Linux/macOS: python3 wcip_agent.py --config config.json</w:t>
+        <w:br/>
+        <w:t>Local backend: sumatra (Windows) | cups (Linux/macOS)</w:t>
+        <w:br/>
+        <w:t>Backend executable: SumatraPDF.exe | /usr/bin/lp</w:t>
+        <w:br/>
+        <w:t>Queue mapping: route -&gt; printer (local installed name)</w:t>
+        <w:br/>
+        <w:t>Private journal: state.sqlite3 (preserve on restart)</w:t>
+        <w:br/>
+        <w:t>python3 -m unittest discover -s print-agent -p "test_*.py"</w:t>
+        <w:br/>
+        <w:t>docs/cross-platform-printing.md · print-agent/README.md</w:t>
+      </w:r>
+    </w:p>
     <w:sectPr>
       <w:headerReference w:type="default" r:id="rId9"/>
       <w:footerReference w:type="default" r:id="rId10"/>
+      <w:headerReference w:type="first" r:id="rId11"/>
+      <w:footerReference w:type="first" r:id="rId12"/>
+      <w:headerReference w:type="even" r:id="rId13"/>
+      <w:footerReference w:type="even" r:id="rId14"/>
       <w:pgSz w:w="12240" w:h="15840"/>
       <w:pgMar w:top="1008" w:right="1008" w:bottom="1008" w:left="1008" w:header="432" w:footer="432" w:gutter="0"/>
       <w:cols w:space="720"/>
@@ -11305,6 +11113,26 @@
 </w:ftr>
 </file>
 
+<file path=word/footer2.xml><?xml version="1.0" encoding="utf-8"?>
+<w:ftr xmlns:m="http://schemas.openxmlformats.org/officeDocument/2006/math" xmlns:mc="http://schemas.openxmlformats.org/markup-compatibility/2006" xmlns:mo="http://schemas.microsoft.com/office/mac/office/2008/main" xmlns:mv="urn:schemas-microsoft-com:mac:vml" xmlns:o="urn:schemas-microsoft-com:office:office" xmlns:r="http://schemas.openxmlformats.org/officeDocument/2006/relationships" xmlns:v="urn:schemas-microsoft-com:vml" xmlns:w10="urn:schemas-microsoft-com:office:word" xmlns:w14="http://schemas.microsoft.com/office/word/2010/wordml" xmlns:w="http://schemas.openxmlformats.org/wordprocessingml/2006/main" xmlns:wne="http://schemas.microsoft.com/office/word/2006/wordml" xmlns:wp14="http://schemas.microsoft.com/office/word/2010/wordprocessingDrawing" xmlns:wp="http://schemas.openxmlformats.org/drawingml/2006/wordprocessingDrawing" xmlns:wpc="http://schemas.microsoft.com/office/word/2010/wordprocessingCanvas" xmlns:wpg="http://schemas.microsoft.com/office/word/2010/wordprocessingGroup" xmlns:wpi="http://schemas.microsoft.com/office/word/2010/wordprocessingInk" xmlns:wps="http://schemas.microsoft.com/office/word/2010/wordprocessingShape" mc:Ignorable="w14 wp14">
+  <w:p>
+    <w:pPr>
+      <w:pStyle w:val="Footer"/>
+    </w:pPr>
+  </w:p>
+</w:ftr>
+</file>
+
+<file path=word/footer3.xml><?xml version="1.0" encoding="utf-8"?>
+<w:ftr xmlns:m="http://schemas.openxmlformats.org/officeDocument/2006/math" xmlns:mc="http://schemas.openxmlformats.org/markup-compatibility/2006" xmlns:mo="http://schemas.microsoft.com/office/mac/office/2008/main" xmlns:mv="urn:schemas-microsoft-com:mac:vml" xmlns:o="urn:schemas-microsoft-com:office:office" xmlns:r="http://schemas.openxmlformats.org/officeDocument/2006/relationships" xmlns:v="urn:schemas-microsoft-com:vml" xmlns:w10="urn:schemas-microsoft-com:office:word" xmlns:w14="http://schemas.microsoft.com/office/word/2010/wordml" xmlns:w="http://schemas.openxmlformats.org/wordprocessingml/2006/main" xmlns:wne="http://schemas.microsoft.com/office/word/2006/wordml" xmlns:wp14="http://schemas.microsoft.com/office/word/2010/wordprocessingDrawing" xmlns:wp="http://schemas.openxmlformats.org/drawingml/2006/wordprocessingDrawing" xmlns:wpc="http://schemas.microsoft.com/office/word/2010/wordprocessingCanvas" xmlns:wpg="http://schemas.microsoft.com/office/word/2010/wordprocessingGroup" xmlns:wpi="http://schemas.microsoft.com/office/word/2010/wordprocessingInk" xmlns:wps="http://schemas.microsoft.com/office/word/2010/wordprocessingShape" mc:Ignorable="w14 wp14">
+  <w:p>
+    <w:pPr>
+      <w:pStyle w:val="Footer"/>
+    </w:pPr>
+  </w:p>
+</w:ftr>
+</file>
+
 <file path=word/header1.xml><?xml version="1.0" encoding="utf-8"?>
 <w:hdr xmlns:m="http://schemas.openxmlformats.org/officeDocument/2006/math" xmlns:mc="http://schemas.openxmlformats.org/markup-compatibility/2006" xmlns:mo="http://schemas.microsoft.com/office/mac/office/2008/main" xmlns:mv="urn:schemas-microsoft-com:mac:vml" xmlns:o="urn:schemas-microsoft-com:office:office" xmlns:r="http://schemas.openxmlformats.org/officeDocument/2006/relationships" xmlns:v="urn:schemas-microsoft-com:vml" xmlns:w10="urn:schemas-microsoft-com:office:word" xmlns:w14="http://schemas.microsoft.com/office/word/2010/wordml" xmlns:w="http://schemas.openxmlformats.org/wordprocessingml/2006/main" xmlns:wne="http://schemas.microsoft.com/office/word/2006/wordml" xmlns:wp14="http://schemas.microsoft.com/office/word/2010/wordprocessingDrawing" xmlns:wp="http://schemas.openxmlformats.org/drawingml/2006/wordprocessingDrawing" xmlns:wpc="http://schemas.microsoft.com/office/word/2010/wordprocessingCanvas" xmlns:wpg="http://schemas.microsoft.com/office/word/2010/wordprocessingGroup" xmlns:wpi="http://schemas.microsoft.com/office/word/2010/wordprocessingInk" xmlns:wps="http://schemas.microsoft.com/office/word/2010/wordprocessingShape" mc:Ignorable="w14 wp14">
   <w:p>
@@ -11321,8 +11149,28 @@
         <w:rtl w:val="0"/>
         <w:lang w:val="en-US" w:eastAsia="ar-SA" w:bidi="ar-SA"/>
       </w:rPr>
-      <w:t>WooCommerce Invoice Printer  1.1.2</w:t>
+      <w:t>WooCommerce Invoice Printer  1.4.0</w:t>
     </w:r>
+  </w:p>
+</w:hdr>
+</file>
+
+<file path=word/header2.xml><?xml version="1.0" encoding="utf-8"?>
+<w:hdr xmlns:m="http://schemas.openxmlformats.org/officeDocument/2006/math" xmlns:mc="http://schemas.openxmlformats.org/markup-compatibility/2006" xmlns:mo="http://schemas.microsoft.com/office/mac/office/2008/main" xmlns:mv="urn:schemas-microsoft-com:mac:vml" xmlns:o="urn:schemas-microsoft-com:office:office" xmlns:r="http://schemas.openxmlformats.org/officeDocument/2006/relationships" xmlns:v="urn:schemas-microsoft-com:vml" xmlns:w10="urn:schemas-microsoft-com:office:word" xmlns:w14="http://schemas.microsoft.com/office/word/2010/wordml" xmlns:w="http://schemas.openxmlformats.org/wordprocessingml/2006/main" xmlns:wne="http://schemas.microsoft.com/office/word/2006/wordml" xmlns:wp14="http://schemas.microsoft.com/office/word/2010/wordprocessingDrawing" xmlns:wp="http://schemas.openxmlformats.org/drawingml/2006/wordprocessingDrawing" xmlns:wpc="http://schemas.microsoft.com/office/word/2010/wordprocessingCanvas" xmlns:wpg="http://schemas.microsoft.com/office/word/2010/wordprocessingGroup" xmlns:wpi="http://schemas.microsoft.com/office/word/2010/wordprocessingInk" xmlns:wps="http://schemas.microsoft.com/office/word/2010/wordprocessingShape" mc:Ignorable="w14 wp14">
+  <w:p>
+    <w:pPr>
+      <w:pStyle w:val="Header"/>
+    </w:pPr>
+  </w:p>
+</w:hdr>
+</file>
+
+<file path=word/header3.xml><?xml version="1.0" encoding="utf-8"?>
+<w:hdr xmlns:m="http://schemas.openxmlformats.org/officeDocument/2006/math" xmlns:mc="http://schemas.openxmlformats.org/markup-compatibility/2006" xmlns:mo="http://schemas.microsoft.com/office/mac/office/2008/main" xmlns:mv="urn:schemas-microsoft-com:mac:vml" xmlns:o="urn:schemas-microsoft-com:office:office" xmlns:r="http://schemas.openxmlformats.org/officeDocument/2006/relationships" xmlns:v="urn:schemas-microsoft-com:vml" xmlns:w10="urn:schemas-microsoft-com:office:word" xmlns:w14="http://schemas.microsoft.com/office/word/2010/wordml" xmlns:w="http://schemas.openxmlformats.org/wordprocessingml/2006/main" xmlns:wne="http://schemas.microsoft.com/office/word/2006/wordml" xmlns:wp14="http://schemas.microsoft.com/office/word/2010/wordprocessingDrawing" xmlns:wp="http://schemas.openxmlformats.org/drawingml/2006/wordprocessingDrawing" xmlns:wpc="http://schemas.microsoft.com/office/word/2010/wordprocessingCanvas" xmlns:wpg="http://schemas.microsoft.com/office/word/2010/wordprocessingGroup" xmlns:wpi="http://schemas.microsoft.com/office/word/2010/wordprocessingInk" xmlns:wps="http://schemas.microsoft.com/office/word/2010/wordprocessingShape" mc:Ignorable="w14 wp14">
+  <w:p>
+    <w:pPr>
+      <w:pStyle w:val="Header"/>
+    </w:pPr>
   </w:p>
 </w:hdr>
 </file>

</xml_diff>